<commit_message>
putting grumbachs things in git
</commit_message>
<xml_diff>
--- a/atkeson_carrillo_citation_map.docx
+++ b/atkeson_carrillo_citation_map.docx
@@ -60,15 +60,9 @@
         <w:gridCol w:w="5508"/>
       </w:tblGrid>
       <w:tr>
-        <w:tblPrEx>
-          <w:tblCellMar>
-            <w:top w:w="0" w:type="dxa"/>
-            <w:bottom w:w="0" w:type="dxa"/>
-          </w:tblCellMar>
-        </w:tblPrEx>
-        <w:tc>
-          <w:tcPr>
-            <w:tcW w:w="2200" w:type="dxa"/>
+        <w:tc>
+          <w:tcPr>
+            <w:tcW w:w="3384" w:type="dxa"/>
             <w:tcBorders>
               <w:top w:val="single" w:sz="1" w:space="0" w:color="999999"/>
               <w:left w:val="single" w:sz="1" w:space="0" w:color="999999"/>
@@ -99,7 +93,7 @@
         </w:tc>
         <w:tc>
           <w:tcPr>
-            <w:tcW w:w="3580" w:type="dxa"/>
+            <w:tcW w:w="5508" w:type="dxa"/>
             <w:tcBorders>
               <w:top w:val="single" w:sz="1" w:space="0" w:color="999999"/>
               <w:left w:val="single" w:sz="1" w:space="0" w:color="999999"/>
@@ -130,7 +124,7 @@
         </w:tc>
         <w:tc>
           <w:tcPr>
-            <w:tcW w:w="3580" w:type="dxa"/>
+            <w:tcW w:w="5508" w:type="dxa"/>
             <w:tcBorders>
               <w:top w:val="single" w:sz="1" w:space="0" w:color="999999"/>
               <w:left w:val="single" w:sz="1" w:space="0" w:color="999999"/>
@@ -161,15 +155,9 @@
         </w:tc>
       </w:tr>
       <w:tr>
-        <w:tblPrEx>
-          <w:tblCellMar>
-            <w:top w:w="0" w:type="dxa"/>
-            <w:bottom w:w="0" w:type="dxa"/>
-          </w:tblCellMar>
-        </w:tblPrEx>
-        <w:tc>
-          <w:tcPr>
-            <w:tcW w:w="9360" w:type="dxa"/>
+        <w:tc>
+          <w:tcPr>
+            <w:tcW w:w="14400" w:type="dxa"/>
             <w:gridSpan w:val="3"/>
             <w:tcBorders>
               <w:top w:val="single" w:sz="1" w:space="0" w:color="999999"/>
@@ -200,15 +188,9 @@
         </w:tc>
       </w:tr>
       <w:tr>
-        <w:tblPrEx>
-          <w:tblCellMar>
-            <w:top w:w="0" w:type="dxa"/>
-            <w:bottom w:w="0" w:type="dxa"/>
-          </w:tblCellMar>
-        </w:tblPrEx>
-        <w:tc>
-          <w:tcPr>
-            <w:tcW w:w="2200" w:type="dxa"/>
+        <w:tc>
+          <w:tcPr>
+            <w:tcW w:w="3384" w:type="dxa"/>
             <w:tcBorders>
               <w:top w:val="single" w:sz="1" w:space="0" w:color="999999"/>
               <w:left w:val="single" w:sz="1" w:space="0" w:color="999999"/>
@@ -235,7 +217,7 @@
         </w:tc>
         <w:tc>
           <w:tcPr>
-            <w:tcW w:w="3580" w:type="dxa"/>
+            <w:tcW w:w="5508" w:type="dxa"/>
             <w:tcBorders>
               <w:top w:val="single" w:sz="1" w:space="0" w:color="999999"/>
               <w:left w:val="single" w:sz="1" w:space="0" w:color="999999"/>
@@ -278,7 +260,7 @@
         </w:tc>
         <w:tc>
           <w:tcPr>
-            <w:tcW w:w="3580" w:type="dxa"/>
+            <w:tcW w:w="5508" w:type="dxa"/>
             <w:tcBorders>
               <w:top w:val="single" w:sz="1" w:space="0" w:color="999999"/>
               <w:left w:val="single" w:sz="1" w:space="0" w:color="999999"/>
@@ -321,15 +303,9 @@
         </w:tc>
       </w:tr>
       <w:tr>
-        <w:tblPrEx>
-          <w:tblCellMar>
-            <w:top w:w="0" w:type="dxa"/>
-            <w:bottom w:w="0" w:type="dxa"/>
-          </w:tblCellMar>
-        </w:tblPrEx>
-        <w:tc>
-          <w:tcPr>
-            <w:tcW w:w="2200" w:type="dxa"/>
+        <w:tc>
+          <w:tcPr>
+            <w:tcW w:w="3384" w:type="dxa"/>
             <w:tcBorders>
               <w:top w:val="single" w:sz="1" w:space="0" w:color="999999"/>
               <w:left w:val="single" w:sz="1" w:space="0" w:color="999999"/>
@@ -356,7 +332,7 @@
         </w:tc>
         <w:tc>
           <w:tcPr>
-            <w:tcW w:w="3580" w:type="dxa"/>
+            <w:tcW w:w="5508" w:type="dxa"/>
             <w:tcBorders>
               <w:top w:val="single" w:sz="1" w:space="0" w:color="999999"/>
               <w:left w:val="single" w:sz="1" w:space="0" w:color="999999"/>
@@ -383,7 +359,7 @@
         </w:tc>
         <w:tc>
           <w:tcPr>
-            <w:tcW w:w="3580" w:type="dxa"/>
+            <w:tcW w:w="5508" w:type="dxa"/>
             <w:tcBorders>
               <w:top w:val="single" w:sz="1" w:space="0" w:color="999999"/>
               <w:left w:val="single" w:sz="1" w:space="0" w:color="999999"/>
@@ -410,15 +386,9 @@
         </w:tc>
       </w:tr>
       <w:tr>
-        <w:tblPrEx>
-          <w:tblCellMar>
-            <w:top w:w="0" w:type="dxa"/>
-            <w:bottom w:w="0" w:type="dxa"/>
-          </w:tblCellMar>
-        </w:tblPrEx>
-        <w:tc>
-          <w:tcPr>
-            <w:tcW w:w="2200" w:type="dxa"/>
+        <w:tc>
+          <w:tcPr>
+            <w:tcW w:w="3384" w:type="dxa"/>
             <w:tcBorders>
               <w:top w:val="single" w:sz="1" w:space="0" w:color="999999"/>
               <w:left w:val="single" w:sz="1" w:space="0" w:color="999999"/>
@@ -445,7 +415,7 @@
         </w:tc>
         <w:tc>
           <w:tcPr>
-            <w:tcW w:w="3580" w:type="dxa"/>
+            <w:tcW w:w="5508" w:type="dxa"/>
             <w:tcBorders>
               <w:top w:val="single" w:sz="1" w:space="0" w:color="999999"/>
               <w:left w:val="single" w:sz="1" w:space="0" w:color="999999"/>
@@ -504,7 +474,7 @@
         </w:tc>
         <w:tc>
           <w:tcPr>
-            <w:tcW w:w="3580" w:type="dxa"/>
+            <w:tcW w:w="5508" w:type="dxa"/>
             <w:tcBorders>
               <w:top w:val="single" w:sz="1" w:space="0" w:color="999999"/>
               <w:left w:val="single" w:sz="1" w:space="0" w:color="999999"/>
@@ -531,15 +501,9 @@
         </w:tc>
       </w:tr>
       <w:tr>
-        <w:tblPrEx>
-          <w:tblCellMar>
-            <w:top w:w="0" w:type="dxa"/>
-            <w:bottom w:w="0" w:type="dxa"/>
-          </w:tblCellMar>
-        </w:tblPrEx>
-        <w:tc>
-          <w:tcPr>
-            <w:tcW w:w="2200" w:type="dxa"/>
+        <w:tc>
+          <w:tcPr>
+            <w:tcW w:w="3384" w:type="dxa"/>
             <w:tcBorders>
               <w:top w:val="single" w:sz="1" w:space="0" w:color="999999"/>
               <w:left w:val="single" w:sz="1" w:space="0" w:color="999999"/>
@@ -566,7 +530,7 @@
         </w:tc>
         <w:tc>
           <w:tcPr>
-            <w:tcW w:w="3580" w:type="dxa"/>
+            <w:tcW w:w="5508" w:type="dxa"/>
             <w:tcBorders>
               <w:top w:val="single" w:sz="1" w:space="0" w:color="999999"/>
               <w:left w:val="single" w:sz="1" w:space="0" w:color="999999"/>
@@ -593,7 +557,7 @@
         </w:tc>
         <w:tc>
           <w:tcPr>
-            <w:tcW w:w="3580" w:type="dxa"/>
+            <w:tcW w:w="5508" w:type="dxa"/>
             <w:tcBorders>
               <w:top w:val="single" w:sz="1" w:space="0" w:color="999999"/>
               <w:left w:val="single" w:sz="1" w:space="0" w:color="999999"/>
@@ -620,15 +584,9 @@
         </w:tc>
       </w:tr>
       <w:tr>
-        <w:tblPrEx>
-          <w:tblCellMar>
-            <w:top w:w="0" w:type="dxa"/>
-            <w:bottom w:w="0" w:type="dxa"/>
-          </w:tblCellMar>
-        </w:tblPrEx>
-        <w:tc>
-          <w:tcPr>
-            <w:tcW w:w="9360" w:type="dxa"/>
+        <w:tc>
+          <w:tcPr>
+            <w:tcW w:w="14400" w:type="dxa"/>
             <w:gridSpan w:val="3"/>
             <w:tcBorders>
               <w:top w:val="single" w:sz="1" w:space="0" w:color="999999"/>
@@ -659,15 +617,9 @@
         </w:tc>
       </w:tr>
       <w:tr>
-        <w:tblPrEx>
-          <w:tblCellMar>
-            <w:top w:w="0" w:type="dxa"/>
-            <w:bottom w:w="0" w:type="dxa"/>
-          </w:tblCellMar>
-        </w:tblPrEx>
-        <w:tc>
-          <w:tcPr>
-            <w:tcW w:w="2200" w:type="dxa"/>
+        <w:tc>
+          <w:tcPr>
+            <w:tcW w:w="3384" w:type="dxa"/>
             <w:tcBorders>
               <w:top w:val="single" w:sz="1" w:space="0" w:color="999999"/>
               <w:left w:val="single" w:sz="1" w:space="0" w:color="999999"/>
@@ -694,7 +646,7 @@
         </w:tc>
         <w:tc>
           <w:tcPr>
-            <w:tcW w:w="3580" w:type="dxa"/>
+            <w:tcW w:w="5508" w:type="dxa"/>
             <w:tcBorders>
               <w:top w:val="single" w:sz="1" w:space="0" w:color="999999"/>
               <w:left w:val="single" w:sz="1" w:space="0" w:color="999999"/>
@@ -737,7 +689,7 @@
         </w:tc>
         <w:tc>
           <w:tcPr>
-            <w:tcW w:w="3580" w:type="dxa"/>
+            <w:tcW w:w="5508" w:type="dxa"/>
             <w:tcBorders>
               <w:top w:val="single" w:sz="1" w:space="0" w:color="999999"/>
               <w:left w:val="single" w:sz="1" w:space="0" w:color="999999"/>
@@ -780,15 +732,9 @@
         </w:tc>
       </w:tr>
       <w:tr>
-        <w:tblPrEx>
-          <w:tblCellMar>
-            <w:top w:w="0" w:type="dxa"/>
-            <w:bottom w:w="0" w:type="dxa"/>
-          </w:tblCellMar>
-        </w:tblPrEx>
-        <w:tc>
-          <w:tcPr>
-            <w:tcW w:w="2200" w:type="dxa"/>
+        <w:tc>
+          <w:tcPr>
+            <w:tcW w:w="3384" w:type="dxa"/>
             <w:tcBorders>
               <w:top w:val="single" w:sz="1" w:space="0" w:color="999999"/>
               <w:left w:val="single" w:sz="1" w:space="0" w:color="999999"/>
@@ -815,7 +761,7 @@
         </w:tc>
         <w:tc>
           <w:tcPr>
-            <w:tcW w:w="3580" w:type="dxa"/>
+            <w:tcW w:w="5508" w:type="dxa"/>
             <w:tcBorders>
               <w:top w:val="single" w:sz="1" w:space="0" w:color="999999"/>
               <w:left w:val="single" w:sz="1" w:space="0" w:color="999999"/>
@@ -842,7 +788,7 @@
         </w:tc>
         <w:tc>
           <w:tcPr>
-            <w:tcW w:w="3580" w:type="dxa"/>
+            <w:tcW w:w="5508" w:type="dxa"/>
             <w:tcBorders>
               <w:top w:val="single" w:sz="1" w:space="0" w:color="999999"/>
               <w:left w:val="single" w:sz="1" w:space="0" w:color="999999"/>
@@ -869,15 +815,9 @@
         </w:tc>
       </w:tr>
       <w:tr>
-        <w:tblPrEx>
-          <w:tblCellMar>
-            <w:top w:w="0" w:type="dxa"/>
-            <w:bottom w:w="0" w:type="dxa"/>
-          </w:tblCellMar>
-        </w:tblPrEx>
-        <w:tc>
-          <w:tcPr>
-            <w:tcW w:w="2200" w:type="dxa"/>
+        <w:tc>
+          <w:tcPr>
+            <w:tcW w:w="3384" w:type="dxa"/>
             <w:tcBorders>
               <w:top w:val="single" w:sz="1" w:space="0" w:color="999999"/>
               <w:left w:val="single" w:sz="1" w:space="0" w:color="999999"/>
@@ -904,7 +844,7 @@
         </w:tc>
         <w:tc>
           <w:tcPr>
-            <w:tcW w:w="3580" w:type="dxa"/>
+            <w:tcW w:w="5508" w:type="dxa"/>
             <w:tcBorders>
               <w:top w:val="single" w:sz="1" w:space="0" w:color="999999"/>
               <w:left w:val="single" w:sz="1" w:space="0" w:color="999999"/>
@@ -947,7 +887,7 @@
         </w:tc>
         <w:tc>
           <w:tcPr>
-            <w:tcW w:w="3580" w:type="dxa"/>
+            <w:tcW w:w="5508" w:type="dxa"/>
             <w:tcBorders>
               <w:top w:val="single" w:sz="1" w:space="0" w:color="999999"/>
               <w:left w:val="single" w:sz="1" w:space="0" w:color="999999"/>
@@ -968,15 +908,7 @@
                 <w:sz w:val="18"/>
                 <w:szCs w:val="18"/>
               </w:rPr>
-              <w:t xml:space="preserve">Important racial parallel. Tate's finding that perceived collective descriptive rep matters more than dyadic rep for Black citizens reinforces the collective-level logic of your project. Her finding on perceived accuracy is interesting given carceral citizens' </w:t>
-            </w:r>
-            <w:r>
-              <w:rPr>
-                <w:sz w:val="18"/>
-                <w:szCs w:val="18"/>
-              </w:rPr>
-              <w:lastRenderedPageBreak/>
-              <w:t xml:space="preserve">communicative isolation—they likely </w:t>
+              <w:t xml:space="preserve">Important racial parallel. Tate's finding that perceived collective descriptive rep matters more than dyadic rep for Black citizens reinforces the collective-level logic of your project. Her finding on perceived accuracy is interesting given carceral citizens' communicative isolation—they likely </w:t>
             </w:r>
             <w:r>
               <w:rPr>
@@ -998,15 +930,9 @@
         </w:tc>
       </w:tr>
       <w:tr>
-        <w:tblPrEx>
-          <w:tblCellMar>
-            <w:top w:w="0" w:type="dxa"/>
-            <w:bottom w:w="0" w:type="dxa"/>
-          </w:tblCellMar>
-        </w:tblPrEx>
-        <w:tc>
-          <w:tcPr>
-            <w:tcW w:w="2200" w:type="dxa"/>
+        <w:tc>
+          <w:tcPr>
+            <w:tcW w:w="3384" w:type="dxa"/>
             <w:tcBorders>
               <w:top w:val="single" w:sz="1" w:space="0" w:color="999999"/>
               <w:left w:val="single" w:sz="1" w:space="0" w:color="999999"/>
@@ -1034,7 +960,7 @@
         </w:tc>
         <w:tc>
           <w:tcPr>
-            <w:tcW w:w="3580" w:type="dxa"/>
+            <w:tcW w:w="5508" w:type="dxa"/>
             <w:tcBorders>
               <w:top w:val="single" w:sz="1" w:space="0" w:color="999999"/>
               <w:left w:val="single" w:sz="1" w:space="0" w:color="999999"/>
@@ -1077,7 +1003,7 @@
         </w:tc>
         <w:tc>
           <w:tcPr>
-            <w:tcW w:w="3580" w:type="dxa"/>
+            <w:tcW w:w="5508" w:type="dxa"/>
             <w:tcBorders>
               <w:top w:val="single" w:sz="1" w:space="0" w:color="999999"/>
               <w:left w:val="single" w:sz="1" w:space="0" w:color="999999"/>
@@ -1104,15 +1030,9 @@
         </w:tc>
       </w:tr>
       <w:tr>
-        <w:tblPrEx>
-          <w:tblCellMar>
-            <w:top w:w="0" w:type="dxa"/>
-            <w:bottom w:w="0" w:type="dxa"/>
-          </w:tblCellMar>
-        </w:tblPrEx>
-        <w:tc>
-          <w:tcPr>
-            <w:tcW w:w="2200" w:type="dxa"/>
+        <w:tc>
+          <w:tcPr>
+            <w:tcW w:w="3384" w:type="dxa"/>
             <w:tcBorders>
               <w:top w:val="single" w:sz="1" w:space="0" w:color="999999"/>
               <w:left w:val="single" w:sz="1" w:space="0" w:color="999999"/>
@@ -1139,7 +1059,7 @@
         </w:tc>
         <w:tc>
           <w:tcPr>
-            <w:tcW w:w="3580" w:type="dxa"/>
+            <w:tcW w:w="5508" w:type="dxa"/>
             <w:tcBorders>
               <w:top w:val="single" w:sz="1" w:space="0" w:color="999999"/>
               <w:left w:val="single" w:sz="1" w:space="0" w:color="999999"/>
@@ -1182,7 +1102,7 @@
         </w:tc>
         <w:tc>
           <w:tcPr>
-            <w:tcW w:w="3580" w:type="dxa"/>
+            <w:tcW w:w="5508" w:type="dxa"/>
             <w:tcBorders>
               <w:top w:val="single" w:sz="1" w:space="0" w:color="999999"/>
               <w:left w:val="single" w:sz="1" w:space="0" w:color="999999"/>
@@ -1209,15 +1129,9 @@
         </w:tc>
       </w:tr>
       <w:tr>
-        <w:tblPrEx>
-          <w:tblCellMar>
-            <w:top w:w="0" w:type="dxa"/>
-            <w:bottom w:w="0" w:type="dxa"/>
-          </w:tblCellMar>
-        </w:tblPrEx>
-        <w:tc>
-          <w:tcPr>
-            <w:tcW w:w="9360" w:type="dxa"/>
+        <w:tc>
+          <w:tcPr>
+            <w:tcW w:w="14400" w:type="dxa"/>
             <w:gridSpan w:val="3"/>
             <w:tcBorders>
               <w:top w:val="single" w:sz="1" w:space="0" w:color="999999"/>
@@ -1248,15 +1162,9 @@
         </w:tc>
       </w:tr>
       <w:tr>
-        <w:tblPrEx>
-          <w:tblCellMar>
-            <w:top w:w="0" w:type="dxa"/>
-            <w:bottom w:w="0" w:type="dxa"/>
-          </w:tblCellMar>
-        </w:tblPrEx>
-        <w:tc>
-          <w:tcPr>
-            <w:tcW w:w="2200" w:type="dxa"/>
+        <w:tc>
+          <w:tcPr>
+            <w:tcW w:w="3384" w:type="dxa"/>
             <w:tcBorders>
               <w:top w:val="single" w:sz="1" w:space="0" w:color="999999"/>
               <w:left w:val="single" w:sz="1" w:space="0" w:color="999999"/>
@@ -1283,7 +1191,7 @@
         </w:tc>
         <w:tc>
           <w:tcPr>
-            <w:tcW w:w="3580" w:type="dxa"/>
+            <w:tcW w:w="5508" w:type="dxa"/>
             <w:tcBorders>
               <w:top w:val="single" w:sz="1" w:space="0" w:color="999999"/>
               <w:left w:val="single" w:sz="1" w:space="0" w:color="999999"/>
@@ -1342,7 +1250,7 @@
         </w:tc>
         <w:tc>
           <w:tcPr>
-            <w:tcW w:w="3580" w:type="dxa"/>
+            <w:tcW w:w="5508" w:type="dxa"/>
             <w:tcBorders>
               <w:top w:val="single" w:sz="1" w:space="0" w:color="999999"/>
               <w:left w:val="single" w:sz="1" w:space="0" w:color="999999"/>
@@ -1369,15 +1277,112 @@
         </w:tc>
       </w:tr>
       <w:tr>
-        <w:tblPrEx>
-          <w:tblCellMar>
-            <w:top w:w="0" w:type="dxa"/>
-            <w:bottom w:w="0" w:type="dxa"/>
-          </w:tblCellMar>
-        </w:tblPrEx>
-        <w:tc>
-          <w:tcPr>
-            <w:tcW w:w="2200" w:type="dxa"/>
+        <w:tc>
+          <w:tcPr>
+            <w:tcW w:w="3384" w:type="dxa"/>
+            <w:tcBorders>
+              <w:top w:val="single" w:sz="1" w:space="0" w:color="999999"/>
+              <w:left w:val="single" w:sz="1" w:space="0" w:color="999999"/>
+              <w:bottom w:val="single" w:sz="1" w:space="0" w:color="999999"/>
+              <w:right w:val="single" w:sz="1" w:space="0" w:color="999999"/>
+            </w:tcBorders>
+            <w:shd w:val="clear" w:color="auto" w:fill="FFFFFF"/>
+            <w:tcMar>
+              <w:top w:w="60" w:type="dxa"/>
+              <w:left w:w="100" w:type="dxa"/>
+              <w:bottom w:w="60" w:type="dxa"/>
+              <w:right w:w="100" w:type="dxa"/>
+            </w:tcMar>
+          </w:tcPr>
+          <w:p>
+            <w:pPr>
+              <w:rPr>
+                <w:sz w:val="18"/>
+                <w:szCs w:val="18"/>
+              </w:rPr>
+            </w:pPr>
+            <w:proofErr w:type="spellStart"/>
+            <w:r>
+              <w:rPr>
+                <w:sz w:val="18"/>
+                <w:szCs w:val="18"/>
+              </w:rPr>
+              <w:t>Broockman</w:t>
+            </w:r>
+            <w:proofErr w:type="spellEnd"/>
+            <w:r>
+              <w:rPr>
+                <w:sz w:val="18"/>
+                <w:szCs w:val="18"/>
+              </w:rPr>
+              <w:t xml:space="preserve"> 2013; Reingold 2000</w:t>
+            </w:r>
+          </w:p>
+        </w:tc>
+        <w:tc>
+          <w:tcPr>
+            <w:tcW w:w="5508" w:type="dxa"/>
+            <w:tcBorders>
+              <w:top w:val="single" w:sz="1" w:space="0" w:color="999999"/>
+              <w:left w:val="single" w:sz="1" w:space="0" w:color="999999"/>
+              <w:bottom w:val="single" w:sz="1" w:space="0" w:color="999999"/>
+              <w:right w:val="single" w:sz="1" w:space="0" w:color="999999"/>
+            </w:tcBorders>
+            <w:shd w:val="clear" w:color="auto" w:fill="FFFFFF"/>
+            <w:tcMar>
+              <w:top w:w="60" w:type="dxa"/>
+              <w:left w:w="100" w:type="dxa"/>
+              <w:bottom w:w="60" w:type="dxa"/>
+              <w:right w:w="100" w:type="dxa"/>
+            </w:tcMar>
+          </w:tcPr>
+          <w:p>
+            <w:pPr>
+              <w:rPr>
+                <w:sz w:val="18"/>
+                <w:szCs w:val="18"/>
+              </w:rPr>
+            </w:pPr>
+            <w:r>
+              <w:rPr>
+                <w:sz w:val="18"/>
+                <w:szCs w:val="18"/>
+              </w:rPr>
+              <w:t xml:space="preserve">May have “intrinsic motivations to represent their group in office” in addition to electoral incentives. </w:t>
+            </w:r>
+          </w:p>
+        </w:tc>
+        <w:tc>
+          <w:tcPr>
+            <w:tcW w:w="5508" w:type="dxa"/>
+            <w:tcBorders>
+              <w:top w:val="single" w:sz="1" w:space="0" w:color="999999"/>
+              <w:left w:val="single" w:sz="1" w:space="0" w:color="999999"/>
+              <w:bottom w:val="single" w:sz="1" w:space="0" w:color="999999"/>
+              <w:right w:val="single" w:sz="1" w:space="0" w:color="999999"/>
+            </w:tcBorders>
+            <w:shd w:val="clear" w:color="auto" w:fill="FFFFFF"/>
+            <w:tcMar>
+              <w:top w:w="60" w:type="dxa"/>
+              <w:left w:w="100" w:type="dxa"/>
+              <w:bottom w:w="60" w:type="dxa"/>
+              <w:right w:w="100" w:type="dxa"/>
+            </w:tcMar>
+          </w:tcPr>
+          <w:p>
+            <w:pPr>
+              <w:rPr>
+                <w:sz w:val="18"/>
+                <w:szCs w:val="18"/>
+              </w:rPr>
+            </w:pPr>
+          </w:p>
+        </w:tc>
+      </w:tr>
+      <w:tr>
+        <w:tc>
+          <w:tcPr>
+            <w:tcW w:w="3384" w:type="dxa"/>
             <w:tcBorders>
               <w:top w:val="single" w:sz="1" w:space="0" w:color="999999"/>
               <w:left w:val="single" w:sz="1" w:space="0" w:color="999999"/>
@@ -1393,6 +1398,12 @@
             </w:tcMar>
           </w:tcPr>
           <w:p>
+            <w:pPr>
+              <w:rPr>
+                <w:sz w:val="18"/>
+                <w:szCs w:val="18"/>
+              </w:rPr>
+            </w:pPr>
             <w:r>
               <w:rPr>
                 <w:sz w:val="18"/>
@@ -1401,10 +1412,48 @@
               <w:t>Berkman &amp; O'Connor 1993; Burrell 1997; Day 1994; Murphy 1997; Thomas 1991</w:t>
             </w:r>
           </w:p>
-        </w:tc>
-        <w:tc>
-          <w:tcPr>
-            <w:tcW w:w="3580" w:type="dxa"/>
+          <w:p>
+            <w:pPr>
+              <w:rPr>
+                <w:sz w:val="18"/>
+                <w:szCs w:val="18"/>
+              </w:rPr>
+            </w:pPr>
+            <w:r>
+              <w:rPr>
+                <w:sz w:val="18"/>
+                <w:szCs w:val="18"/>
+              </w:rPr>
+              <w:t>-</w:t>
+            </w:r>
+          </w:p>
+          <w:p>
+            <w:r>
+              <w:t>Bratton &amp; Haynie 1999; Reingold 2008; Rouse 2013</w:t>
+            </w:r>
+          </w:p>
+          <w:p>
+            <w:r>
+              <w:t>--</w:t>
+            </w:r>
+          </w:p>
+          <w:p>
+            <w:r>
+              <w:t xml:space="preserve">Butler and </w:t>
+            </w:r>
+            <w:proofErr w:type="spellStart"/>
+            <w:r>
+              <w:t>Broockman</w:t>
+            </w:r>
+            <w:proofErr w:type="spellEnd"/>
+            <w:r>
+              <w:t xml:space="preserve"> 2011, Minta 2009</w:t>
+            </w:r>
+          </w:p>
+        </w:tc>
+        <w:tc>
+          <w:tcPr>
+            <w:tcW w:w="5508" w:type="dxa"/>
             <w:tcBorders>
               <w:top w:val="single" w:sz="1" w:space="0" w:color="999999"/>
               <w:left w:val="single" w:sz="1" w:space="0" w:color="999999"/>
@@ -1420,6 +1469,12 @@
             </w:tcMar>
           </w:tcPr>
           <w:p>
+            <w:pPr>
+              <w:rPr>
+                <w:sz w:val="18"/>
+                <w:szCs w:val="18"/>
+              </w:rPr>
+            </w:pPr>
             <w:r>
               <w:rPr>
                 <w:sz w:val="18"/>
@@ -1444,10 +1499,50 @@
               <w:t xml:space="preserve"> to female policy priorities, though not necessarily policy outputs.</w:t>
             </w:r>
           </w:p>
-        </w:tc>
-        <w:tc>
-          <w:tcPr>
-            <w:tcW w:w="3580" w:type="dxa"/>
+          <w:p>
+            <w:pPr>
+              <w:rPr>
+                <w:sz w:val="18"/>
+                <w:szCs w:val="18"/>
+              </w:rPr>
+            </w:pPr>
+            <w:r>
+              <w:rPr>
+                <w:sz w:val="18"/>
+                <w:szCs w:val="18"/>
+              </w:rPr>
+              <w:t>-</w:t>
+            </w:r>
+          </w:p>
+          <w:p>
+            <w:pPr>
+              <w:rPr>
+                <w:sz w:val="18"/>
+                <w:szCs w:val="18"/>
+              </w:rPr>
+            </w:pPr>
+            <w:r>
+              <w:rPr>
+                <w:sz w:val="18"/>
+                <w:szCs w:val="18"/>
+              </w:rPr>
+              <w:t>Descriptive reps sponsor more bills</w:t>
+            </w:r>
+          </w:p>
+          <w:p>
+            <w:r>
+              <w:t>--</w:t>
+            </w:r>
+          </w:p>
+          <w:p>
+            <w:r>
+              <w:t>Spend political capital</w:t>
+            </w:r>
+          </w:p>
+        </w:tc>
+        <w:tc>
+          <w:tcPr>
+            <w:tcW w:w="5508" w:type="dxa"/>
             <w:tcBorders>
               <w:top w:val="single" w:sz="1" w:space="0" w:color="999999"/>
               <w:left w:val="single" w:sz="1" w:space="0" w:color="999999"/>
@@ -1474,15 +1569,117 @@
         </w:tc>
       </w:tr>
       <w:tr>
-        <w:tblPrEx>
-          <w:tblCellMar>
-            <w:top w:w="0" w:type="dxa"/>
-            <w:bottom w:w="0" w:type="dxa"/>
-          </w:tblCellMar>
-        </w:tblPrEx>
-        <w:tc>
-          <w:tcPr>
-            <w:tcW w:w="2200" w:type="dxa"/>
+        <w:tc>
+          <w:tcPr>
+            <w:tcW w:w="3384" w:type="dxa"/>
+            <w:tcBorders>
+              <w:top w:val="single" w:sz="1" w:space="0" w:color="999999"/>
+              <w:left w:val="single" w:sz="1" w:space="0" w:color="999999"/>
+              <w:bottom w:val="single" w:sz="1" w:space="0" w:color="999999"/>
+              <w:right w:val="single" w:sz="1" w:space="0" w:color="999999"/>
+            </w:tcBorders>
+            <w:shd w:val="clear" w:color="auto" w:fill="F5F5F5"/>
+            <w:tcMar>
+              <w:top w:w="60" w:type="dxa"/>
+              <w:left w:w="100" w:type="dxa"/>
+              <w:bottom w:w="60" w:type="dxa"/>
+              <w:right w:w="100" w:type="dxa"/>
+            </w:tcMar>
+          </w:tcPr>
+          <w:p>
+            <w:pPr>
+              <w:rPr>
+                <w:sz w:val="18"/>
+                <w:szCs w:val="18"/>
+              </w:rPr>
+            </w:pPr>
+            <w:r>
+              <w:rPr>
+                <w:sz w:val="18"/>
+                <w:szCs w:val="18"/>
+              </w:rPr>
+              <w:t>Citing Hero 1998, Hero and Tolbert 1996</w:t>
+            </w:r>
+          </w:p>
+        </w:tc>
+        <w:tc>
+          <w:tcPr>
+            <w:tcW w:w="5508" w:type="dxa"/>
+            <w:tcBorders>
+              <w:top w:val="single" w:sz="1" w:space="0" w:color="999999"/>
+              <w:left w:val="single" w:sz="1" w:space="0" w:color="999999"/>
+              <w:bottom w:val="single" w:sz="1" w:space="0" w:color="999999"/>
+              <w:right w:val="single" w:sz="1" w:space="0" w:color="999999"/>
+            </w:tcBorders>
+            <w:shd w:val="clear" w:color="auto" w:fill="F5F5F5"/>
+            <w:tcMar>
+              <w:top w:w="60" w:type="dxa"/>
+              <w:left w:w="100" w:type="dxa"/>
+              <w:bottom w:w="60" w:type="dxa"/>
+              <w:right w:w="100" w:type="dxa"/>
+            </w:tcMar>
+          </w:tcPr>
+          <w:p>
+            <w:pPr>
+              <w:rPr>
+                <w:sz w:val="18"/>
+                <w:szCs w:val="18"/>
+              </w:rPr>
+            </w:pPr>
+            <w:r>
+              <w:rPr>
+                <w:sz w:val="18"/>
+                <w:szCs w:val="18"/>
+              </w:rPr>
+              <w:t>“</w:t>
+            </w:r>
+            <w:r>
+              <w:t xml:space="preserve">African Americans do relatively better in terms of policy outcomes (defined as graduation ratios, incarceration ratios, and suspension ratios) in states with higher racial </w:t>
+            </w:r>
+            <w:proofErr w:type="gramStart"/>
+            <w:r>
+              <w:t>diversity</w:t>
+            </w:r>
+            <w:r>
+              <w:t>(</w:t>
+            </w:r>
+            <w:proofErr w:type="gramEnd"/>
+            <w:r>
+              <w:t>Rocha, Tolbert, Bowen, and Clark 2010, 891)</w:t>
+            </w:r>
+          </w:p>
+        </w:tc>
+        <w:tc>
+          <w:tcPr>
+            <w:tcW w:w="5508" w:type="dxa"/>
+            <w:tcBorders>
+              <w:top w:val="single" w:sz="1" w:space="0" w:color="999999"/>
+              <w:left w:val="single" w:sz="1" w:space="0" w:color="999999"/>
+              <w:bottom w:val="single" w:sz="1" w:space="0" w:color="999999"/>
+              <w:right w:val="single" w:sz="1" w:space="0" w:color="999999"/>
+            </w:tcBorders>
+            <w:shd w:val="clear" w:color="auto" w:fill="F5F5F5"/>
+            <w:tcMar>
+              <w:top w:w="60" w:type="dxa"/>
+              <w:left w:w="100" w:type="dxa"/>
+              <w:bottom w:w="60" w:type="dxa"/>
+              <w:right w:w="100" w:type="dxa"/>
+            </w:tcMar>
+          </w:tcPr>
+          <w:p>
+            <w:pPr>
+              <w:rPr>
+                <w:sz w:val="18"/>
+                <w:szCs w:val="18"/>
+              </w:rPr>
+            </w:pPr>
+          </w:p>
+        </w:tc>
+      </w:tr>
+      <w:tr>
+        <w:tc>
+          <w:tcPr>
+            <w:tcW w:w="3384" w:type="dxa"/>
             <w:tcBorders>
               <w:top w:val="single" w:sz="1" w:space="0" w:color="999999"/>
               <w:left w:val="single" w:sz="1" w:space="0" w:color="999999"/>
@@ -1509,7 +1706,7 @@
         </w:tc>
         <w:tc>
           <w:tcPr>
-            <w:tcW w:w="3580" w:type="dxa"/>
+            <w:tcW w:w="5508" w:type="dxa"/>
             <w:tcBorders>
               <w:top w:val="single" w:sz="1" w:space="0" w:color="999999"/>
               <w:left w:val="single" w:sz="1" w:space="0" w:color="999999"/>
@@ -1552,7 +1749,7 @@
         </w:tc>
         <w:tc>
           <w:tcPr>
-            <w:tcW w:w="3580" w:type="dxa"/>
+            <w:tcW w:w="5508" w:type="dxa"/>
             <w:tcBorders>
               <w:top w:val="single" w:sz="1" w:space="0" w:color="999999"/>
               <w:left w:val="single" w:sz="1" w:space="0" w:color="999999"/>
@@ -1579,15 +1776,9 @@
         </w:tc>
       </w:tr>
       <w:tr>
-        <w:tblPrEx>
-          <w:tblCellMar>
-            <w:top w:w="0" w:type="dxa"/>
-            <w:bottom w:w="0" w:type="dxa"/>
-          </w:tblCellMar>
-        </w:tblPrEx>
-        <w:tc>
-          <w:tcPr>
-            <w:tcW w:w="2200" w:type="dxa"/>
+        <w:tc>
+          <w:tcPr>
+            <w:tcW w:w="3384" w:type="dxa"/>
             <w:tcBorders>
               <w:top w:val="single" w:sz="1" w:space="0" w:color="999999"/>
               <w:left w:val="single" w:sz="1" w:space="0" w:color="999999"/>
@@ -1614,7 +1805,7 @@
         </w:tc>
         <w:tc>
           <w:tcPr>
-            <w:tcW w:w="3580" w:type="dxa"/>
+            <w:tcW w:w="5508" w:type="dxa"/>
             <w:tcBorders>
               <w:top w:val="single" w:sz="1" w:space="0" w:color="999999"/>
               <w:left w:val="single" w:sz="1" w:space="0" w:color="999999"/>
@@ -1657,7 +1848,7 @@
         </w:tc>
         <w:tc>
           <w:tcPr>
-            <w:tcW w:w="3580" w:type="dxa"/>
+            <w:tcW w:w="5508" w:type="dxa"/>
             <w:tcBorders>
               <w:top w:val="single" w:sz="1" w:space="0" w:color="999999"/>
               <w:left w:val="single" w:sz="1" w:space="0" w:color="999999"/>
@@ -1684,15 +1875,9 @@
         </w:tc>
       </w:tr>
       <w:tr>
-        <w:tblPrEx>
-          <w:tblCellMar>
-            <w:top w:w="0" w:type="dxa"/>
-            <w:bottom w:w="0" w:type="dxa"/>
-          </w:tblCellMar>
-        </w:tblPrEx>
-        <w:tc>
-          <w:tcPr>
-            <w:tcW w:w="2200" w:type="dxa"/>
+        <w:tc>
+          <w:tcPr>
+            <w:tcW w:w="3384" w:type="dxa"/>
             <w:tcBorders>
               <w:top w:val="single" w:sz="1" w:space="0" w:color="999999"/>
               <w:left w:val="single" w:sz="1" w:space="0" w:color="999999"/>
@@ -1719,7 +1904,7 @@
         </w:tc>
         <w:tc>
           <w:tcPr>
-            <w:tcW w:w="3580" w:type="dxa"/>
+            <w:tcW w:w="5508" w:type="dxa"/>
             <w:tcBorders>
               <w:top w:val="single" w:sz="1" w:space="0" w:color="999999"/>
               <w:left w:val="single" w:sz="1" w:space="0" w:color="999999"/>
@@ -1762,7 +1947,7 @@
         </w:tc>
         <w:tc>
           <w:tcPr>
-            <w:tcW w:w="3580" w:type="dxa"/>
+            <w:tcW w:w="5508" w:type="dxa"/>
             <w:tcBorders>
               <w:top w:val="single" w:sz="1" w:space="0" w:color="999999"/>
               <w:left w:val="single" w:sz="1" w:space="0" w:color="999999"/>
@@ -1783,21 +1968,23 @@
                 <w:sz w:val="18"/>
                 <w:szCs w:val="18"/>
               </w:rPr>
-              <w:t>Cross-national evidence for the collective representation → legitimacy pathway. Useful for framing your project's stakes: if collective symbolic representation shapes institutional trust, then the near-total absence of carceral citizens from the representational imaginary has implications for democratic legitimacy writ large.</w:t>
+              <w:t xml:space="preserve">Cross-national evidence for the collective representation → legitimacy pathway. Useful for framing your project's stakes: if collective symbolic representation shapes institutional trust, then the near-total absence of </w:t>
+            </w:r>
+            <w:r>
+              <w:rPr>
+                <w:sz w:val="18"/>
+                <w:szCs w:val="18"/>
+              </w:rPr>
+              <w:lastRenderedPageBreak/>
+              <w:t>carceral citizens from the representational imaginary has implications for democratic legitimacy writ large.</w:t>
             </w:r>
           </w:p>
         </w:tc>
       </w:tr>
       <w:tr>
-        <w:tblPrEx>
-          <w:tblCellMar>
-            <w:top w:w="0" w:type="dxa"/>
-            <w:bottom w:w="0" w:type="dxa"/>
-          </w:tblCellMar>
-        </w:tblPrEx>
-        <w:tc>
-          <w:tcPr>
-            <w:tcW w:w="9360" w:type="dxa"/>
+        <w:tc>
+          <w:tcPr>
+            <w:tcW w:w="14400" w:type="dxa"/>
             <w:gridSpan w:val="3"/>
             <w:tcBorders>
               <w:top w:val="single" w:sz="1" w:space="0" w:color="999999"/>
@@ -1822,21 +2009,16 @@
                 <w:sz w:val="19"/>
                 <w:szCs w:val="19"/>
               </w:rPr>
+              <w:lastRenderedPageBreak/>
               <w:t>D. Awareness / Visibility Mechanisms</w:t>
             </w:r>
           </w:p>
         </w:tc>
       </w:tr>
       <w:tr>
-        <w:tblPrEx>
-          <w:tblCellMar>
-            <w:top w:w="0" w:type="dxa"/>
-            <w:bottom w:w="0" w:type="dxa"/>
-          </w:tblCellMar>
-        </w:tblPrEx>
-        <w:tc>
-          <w:tcPr>
-            <w:tcW w:w="2200" w:type="dxa"/>
+        <w:tc>
+          <w:tcPr>
+            <w:tcW w:w="3384" w:type="dxa"/>
             <w:tcBorders>
               <w:top w:val="single" w:sz="1" w:space="0" w:color="999999"/>
               <w:left w:val="single" w:sz="1" w:space="0" w:color="999999"/>
@@ -1863,7 +2045,7 @@
         </w:tc>
         <w:tc>
           <w:tcPr>
-            <w:tcW w:w="3580" w:type="dxa"/>
+            <w:tcW w:w="5508" w:type="dxa"/>
             <w:tcBorders>
               <w:top w:val="single" w:sz="1" w:space="0" w:color="999999"/>
               <w:left w:val="single" w:sz="1" w:space="0" w:color="999999"/>
@@ -1890,7 +2072,7 @@
         </w:tc>
         <w:tc>
           <w:tcPr>
-            <w:tcW w:w="3580" w:type="dxa"/>
+            <w:tcW w:w="5508" w:type="dxa"/>
             <w:tcBorders>
               <w:top w:val="single" w:sz="1" w:space="0" w:color="999999"/>
               <w:left w:val="single" w:sz="1" w:space="0" w:color="999999"/>
@@ -1917,15 +2099,9 @@
         </w:tc>
       </w:tr>
       <w:tr>
-        <w:tblPrEx>
-          <w:tblCellMar>
-            <w:top w:w="0" w:type="dxa"/>
-            <w:bottom w:w="0" w:type="dxa"/>
-          </w:tblCellMar>
-        </w:tblPrEx>
-        <w:tc>
-          <w:tcPr>
-            <w:tcW w:w="2200" w:type="dxa"/>
+        <w:tc>
+          <w:tcPr>
+            <w:tcW w:w="3384" w:type="dxa"/>
             <w:tcBorders>
               <w:top w:val="single" w:sz="1" w:space="0" w:color="999999"/>
               <w:left w:val="single" w:sz="1" w:space="0" w:color="999999"/>
@@ -1946,7 +2122,6 @@
                 <w:sz w:val="18"/>
                 <w:szCs w:val="18"/>
               </w:rPr>
-              <w:lastRenderedPageBreak/>
               <w:t xml:space="preserve">Hinckley, Hofstetter &amp; Kessel 1974; Squire &amp; </w:t>
             </w:r>
             <w:proofErr w:type="spellStart"/>
@@ -1985,7 +2160,7 @@
         </w:tc>
         <w:tc>
           <w:tcPr>
-            <w:tcW w:w="3580" w:type="dxa"/>
+            <w:tcW w:w="5508" w:type="dxa"/>
             <w:tcBorders>
               <w:top w:val="single" w:sz="1" w:space="0" w:color="999999"/>
               <w:left w:val="single" w:sz="1" w:space="0" w:color="999999"/>
@@ -2028,7 +2203,7 @@
         </w:tc>
         <w:tc>
           <w:tcPr>
-            <w:tcW w:w="3580" w:type="dxa"/>
+            <w:tcW w:w="5508" w:type="dxa"/>
             <w:tcBorders>
               <w:top w:val="single" w:sz="1" w:space="0" w:color="999999"/>
               <w:left w:val="single" w:sz="1" w:space="0" w:color="999999"/>
@@ -2055,15 +2230,9 @@
         </w:tc>
       </w:tr>
       <w:tr>
-        <w:tblPrEx>
-          <w:tblCellMar>
-            <w:top w:w="0" w:type="dxa"/>
-            <w:bottom w:w="0" w:type="dxa"/>
-          </w:tblCellMar>
-        </w:tblPrEx>
-        <w:tc>
-          <w:tcPr>
-            <w:tcW w:w="2200" w:type="dxa"/>
+        <w:tc>
+          <w:tcPr>
+            <w:tcW w:w="3384" w:type="dxa"/>
             <w:tcBorders>
               <w:top w:val="single" w:sz="1" w:space="0" w:color="999999"/>
               <w:left w:val="single" w:sz="1" w:space="0" w:color="999999"/>
@@ -2090,7 +2259,7 @@
         </w:tc>
         <w:tc>
           <w:tcPr>
-            <w:tcW w:w="3580" w:type="dxa"/>
+            <w:tcW w:w="5508" w:type="dxa"/>
             <w:tcBorders>
               <w:top w:val="single" w:sz="1" w:space="0" w:color="999999"/>
               <w:left w:val="single" w:sz="1" w:space="0" w:color="999999"/>
@@ -2149,7 +2318,7 @@
         </w:tc>
         <w:tc>
           <w:tcPr>
-            <w:tcW w:w="3580" w:type="dxa"/>
+            <w:tcW w:w="5508" w:type="dxa"/>
             <w:tcBorders>
               <w:top w:val="single" w:sz="1" w:space="0" w:color="999999"/>
               <w:left w:val="single" w:sz="1" w:space="0" w:color="999999"/>
@@ -2176,15 +2345,9 @@
         </w:tc>
       </w:tr>
       <w:tr>
-        <w:tblPrEx>
-          <w:tblCellMar>
-            <w:top w:w="0" w:type="dxa"/>
-            <w:bottom w:w="0" w:type="dxa"/>
-          </w:tblCellMar>
-        </w:tblPrEx>
-        <w:tc>
-          <w:tcPr>
-            <w:tcW w:w="9360" w:type="dxa"/>
+        <w:tc>
+          <w:tcPr>
+            <w:tcW w:w="14400" w:type="dxa"/>
             <w:gridSpan w:val="3"/>
             <w:tcBorders>
               <w:top w:val="single" w:sz="1" w:space="0" w:color="999999"/>
@@ -2215,15 +2378,9 @@
         </w:tc>
       </w:tr>
       <w:tr>
-        <w:tblPrEx>
-          <w:tblCellMar>
-            <w:top w:w="0" w:type="dxa"/>
-            <w:bottom w:w="0" w:type="dxa"/>
-          </w:tblCellMar>
-        </w:tblPrEx>
-        <w:tc>
-          <w:tcPr>
-            <w:tcW w:w="2200" w:type="dxa"/>
+        <w:tc>
+          <w:tcPr>
+            <w:tcW w:w="3384" w:type="dxa"/>
             <w:tcBorders>
               <w:top w:val="single" w:sz="1" w:space="0" w:color="999999"/>
               <w:left w:val="single" w:sz="1" w:space="0" w:color="999999"/>
@@ -2282,7 +2439,7 @@
         </w:tc>
         <w:tc>
           <w:tcPr>
-            <w:tcW w:w="3580" w:type="dxa"/>
+            <w:tcW w:w="5508" w:type="dxa"/>
             <w:tcBorders>
               <w:top w:val="single" w:sz="1" w:space="0" w:color="999999"/>
               <w:left w:val="single" w:sz="1" w:space="0" w:color="999999"/>
@@ -2318,7 +2475,7 @@
         </w:tc>
         <w:tc>
           <w:tcPr>
-            <w:tcW w:w="3580" w:type="dxa"/>
+            <w:tcW w:w="5508" w:type="dxa"/>
             <w:tcBorders>
               <w:top w:val="single" w:sz="1" w:space="0" w:color="999999"/>
               <w:left w:val="single" w:sz="1" w:space="0" w:color="999999"/>
@@ -2345,15 +2502,9 @@
         </w:tc>
       </w:tr>
       <w:tr>
-        <w:tblPrEx>
-          <w:tblCellMar>
-            <w:top w:w="0" w:type="dxa"/>
-            <w:bottom w:w="0" w:type="dxa"/>
-          </w:tblCellMar>
-        </w:tblPrEx>
-        <w:tc>
-          <w:tcPr>
-            <w:tcW w:w="2200" w:type="dxa"/>
+        <w:tc>
+          <w:tcPr>
+            <w:tcW w:w="3384" w:type="dxa"/>
             <w:tcBorders>
               <w:top w:val="single" w:sz="1" w:space="0" w:color="999999"/>
               <w:left w:val="single" w:sz="1" w:space="0" w:color="999999"/>
@@ -2380,7 +2531,7 @@
         </w:tc>
         <w:tc>
           <w:tcPr>
-            <w:tcW w:w="3580" w:type="dxa"/>
+            <w:tcW w:w="5508" w:type="dxa"/>
             <w:tcBorders>
               <w:top w:val="single" w:sz="1" w:space="0" w:color="999999"/>
               <w:left w:val="single" w:sz="1" w:space="0" w:color="999999"/>
@@ -2423,7 +2574,7 @@
         </w:tc>
         <w:tc>
           <w:tcPr>
-            <w:tcW w:w="3580" w:type="dxa"/>
+            <w:tcW w:w="5508" w:type="dxa"/>
             <w:tcBorders>
               <w:top w:val="single" w:sz="1" w:space="0" w:color="999999"/>
               <w:left w:val="single" w:sz="1" w:space="0" w:color="999999"/>
@@ -2450,15 +2601,9 @@
         </w:tc>
       </w:tr>
       <w:tr>
-        <w:tblPrEx>
-          <w:tblCellMar>
-            <w:top w:w="0" w:type="dxa"/>
-            <w:bottom w:w="0" w:type="dxa"/>
-          </w:tblCellMar>
-        </w:tblPrEx>
-        <w:tc>
-          <w:tcPr>
-            <w:tcW w:w="2200" w:type="dxa"/>
+        <w:tc>
+          <w:tcPr>
+            <w:tcW w:w="3384" w:type="dxa"/>
             <w:tcBorders>
               <w:top w:val="single" w:sz="1" w:space="0" w:color="999999"/>
               <w:left w:val="single" w:sz="1" w:space="0" w:color="999999"/>
@@ -2485,7 +2630,7 @@
         </w:tc>
         <w:tc>
           <w:tcPr>
-            <w:tcW w:w="3580" w:type="dxa"/>
+            <w:tcW w:w="5508" w:type="dxa"/>
             <w:tcBorders>
               <w:top w:val="single" w:sz="1" w:space="0" w:color="999999"/>
               <w:left w:val="single" w:sz="1" w:space="0" w:color="999999"/>
@@ -2528,7 +2673,7 @@
         </w:tc>
         <w:tc>
           <w:tcPr>
-            <w:tcW w:w="3580" w:type="dxa"/>
+            <w:tcW w:w="5508" w:type="dxa"/>
             <w:tcBorders>
               <w:top w:val="single" w:sz="1" w:space="0" w:color="999999"/>
               <w:left w:val="single" w:sz="1" w:space="0" w:color="999999"/>
@@ -2555,15 +2700,9 @@
         </w:tc>
       </w:tr>
       <w:tr>
-        <w:tblPrEx>
-          <w:tblCellMar>
-            <w:top w:w="0" w:type="dxa"/>
-            <w:bottom w:w="0" w:type="dxa"/>
-          </w:tblCellMar>
-        </w:tblPrEx>
-        <w:tc>
-          <w:tcPr>
-            <w:tcW w:w="9360" w:type="dxa"/>
+        <w:tc>
+          <w:tcPr>
+            <w:tcW w:w="14400" w:type="dxa"/>
             <w:gridSpan w:val="3"/>
             <w:tcBorders>
               <w:top w:val="single" w:sz="1" w:space="0" w:color="999999"/>
@@ -2594,15 +2733,9 @@
         </w:tc>
       </w:tr>
       <w:tr>
-        <w:tblPrEx>
-          <w:tblCellMar>
-            <w:top w:w="0" w:type="dxa"/>
-            <w:bottom w:w="0" w:type="dxa"/>
-          </w:tblCellMar>
-        </w:tblPrEx>
-        <w:tc>
-          <w:tcPr>
-            <w:tcW w:w="2200" w:type="dxa"/>
+        <w:tc>
+          <w:tcPr>
+            <w:tcW w:w="3384" w:type="dxa"/>
             <w:tcBorders>
               <w:top w:val="single" w:sz="1" w:space="0" w:color="999999"/>
               <w:left w:val="single" w:sz="1" w:space="0" w:color="999999"/>
@@ -2629,7 +2762,7 @@
         </w:tc>
         <w:tc>
           <w:tcPr>
-            <w:tcW w:w="3580" w:type="dxa"/>
+            <w:tcW w:w="5508" w:type="dxa"/>
             <w:tcBorders>
               <w:top w:val="single" w:sz="1" w:space="0" w:color="999999"/>
               <w:left w:val="single" w:sz="1" w:space="0" w:color="999999"/>
@@ -2672,7 +2805,7 @@
         </w:tc>
         <w:tc>
           <w:tcPr>
-            <w:tcW w:w="3580" w:type="dxa"/>
+            <w:tcW w:w="5508" w:type="dxa"/>
             <w:tcBorders>
               <w:top w:val="single" w:sz="1" w:space="0" w:color="999999"/>
               <w:left w:val="single" w:sz="1" w:space="0" w:color="999999"/>
@@ -2699,15 +2832,9 @@
         </w:tc>
       </w:tr>
       <w:tr>
-        <w:tblPrEx>
-          <w:tblCellMar>
-            <w:top w:w="0" w:type="dxa"/>
-            <w:bottom w:w="0" w:type="dxa"/>
-          </w:tblCellMar>
-        </w:tblPrEx>
-        <w:tc>
-          <w:tcPr>
-            <w:tcW w:w="2200" w:type="dxa"/>
+        <w:tc>
+          <w:tcPr>
+            <w:tcW w:w="3384" w:type="dxa"/>
             <w:tcBorders>
               <w:top w:val="single" w:sz="1" w:space="0" w:color="999999"/>
               <w:left w:val="single" w:sz="1" w:space="0" w:color="999999"/>
@@ -2734,7 +2861,7 @@
         </w:tc>
         <w:tc>
           <w:tcPr>
-            <w:tcW w:w="3580" w:type="dxa"/>
+            <w:tcW w:w="5508" w:type="dxa"/>
             <w:tcBorders>
               <w:top w:val="single" w:sz="1" w:space="0" w:color="999999"/>
               <w:left w:val="single" w:sz="1" w:space="0" w:color="999999"/>
@@ -2777,7 +2904,7 @@
         </w:tc>
         <w:tc>
           <w:tcPr>
-            <w:tcW w:w="3580" w:type="dxa"/>
+            <w:tcW w:w="5508" w:type="dxa"/>
             <w:tcBorders>
               <w:top w:val="single" w:sz="1" w:space="0" w:color="999999"/>
               <w:left w:val="single" w:sz="1" w:space="0" w:color="999999"/>
@@ -2798,21 +2925,23 @@
                 <w:sz w:val="18"/>
                 <w:szCs w:val="18"/>
               </w:rPr>
-              <w:t>Connects to your argument about democratic legitimacy and the "special cases" framework. If symbolic exclusion of carceral citizens depresses their sense of government responsiveness, this has implications for democratic stability—especially given the scale of carceral contact in the U.S.</w:t>
+              <w:t xml:space="preserve">Connects to your argument about democratic legitimacy and the "special cases" framework. If symbolic exclusion of carceral citizens depresses their sense of government responsiveness, this has implications for </w:t>
+            </w:r>
+            <w:r>
+              <w:rPr>
+                <w:sz w:val="18"/>
+                <w:szCs w:val="18"/>
+              </w:rPr>
+              <w:lastRenderedPageBreak/>
+              <w:t>democratic stability—especially given the scale of carceral contact in the U.S.</w:t>
             </w:r>
           </w:p>
         </w:tc>
       </w:tr>
       <w:tr>
-        <w:tblPrEx>
-          <w:tblCellMar>
-            <w:top w:w="0" w:type="dxa"/>
-            <w:bottom w:w="0" w:type="dxa"/>
-          </w:tblCellMar>
-        </w:tblPrEx>
-        <w:tc>
-          <w:tcPr>
-            <w:tcW w:w="2200" w:type="dxa"/>
+        <w:tc>
+          <w:tcPr>
+            <w:tcW w:w="3384" w:type="dxa"/>
             <w:tcBorders>
               <w:top w:val="single" w:sz="1" w:space="0" w:color="999999"/>
               <w:left w:val="single" w:sz="1" w:space="0" w:color="999999"/>
@@ -2833,13 +2962,14 @@
                 <w:sz w:val="18"/>
                 <w:szCs w:val="18"/>
               </w:rPr>
+              <w:lastRenderedPageBreak/>
               <w:t>Campbell et al. 1960; Rosenstone &amp; Hansen 1993</w:t>
             </w:r>
           </w:p>
         </w:tc>
         <w:tc>
           <w:tcPr>
-            <w:tcW w:w="3580" w:type="dxa"/>
+            <w:tcW w:w="5508" w:type="dxa"/>
             <w:tcBorders>
               <w:top w:val="single" w:sz="1" w:space="0" w:color="999999"/>
               <w:left w:val="single" w:sz="1" w:space="0" w:color="999999"/>
@@ -2882,7 +3012,7 @@
         </w:tc>
         <w:tc>
           <w:tcPr>
-            <w:tcW w:w="3580" w:type="dxa"/>
+            <w:tcW w:w="5508" w:type="dxa"/>
             <w:tcBorders>
               <w:top w:val="single" w:sz="1" w:space="0" w:color="999999"/>
               <w:left w:val="single" w:sz="1" w:space="0" w:color="999999"/>
@@ -2909,15 +3039,9 @@
         </w:tc>
       </w:tr>
       <w:tr>
-        <w:tblPrEx>
-          <w:tblCellMar>
-            <w:top w:w="0" w:type="dxa"/>
-            <w:bottom w:w="0" w:type="dxa"/>
-          </w:tblCellMar>
-        </w:tblPrEx>
-        <w:tc>
-          <w:tcPr>
-            <w:tcW w:w="9360" w:type="dxa"/>
+        <w:tc>
+          <w:tcPr>
+            <w:tcW w:w="14400" w:type="dxa"/>
             <w:gridSpan w:val="3"/>
             <w:tcBorders>
               <w:top w:val="single" w:sz="1" w:space="0" w:color="999999"/>
@@ -2942,22 +3066,15 @@
                 <w:sz w:val="19"/>
                 <w:szCs w:val="19"/>
               </w:rPr>
-              <w:lastRenderedPageBreak/>
               <w:t>G. Substantive Representation &amp; Party Cues</w:t>
             </w:r>
           </w:p>
         </w:tc>
       </w:tr>
       <w:tr>
-        <w:tblPrEx>
-          <w:tblCellMar>
-            <w:top w:w="0" w:type="dxa"/>
-            <w:bottom w:w="0" w:type="dxa"/>
-          </w:tblCellMar>
-        </w:tblPrEx>
-        <w:tc>
-          <w:tcPr>
-            <w:tcW w:w="2200" w:type="dxa"/>
+        <w:tc>
+          <w:tcPr>
+            <w:tcW w:w="3384" w:type="dxa"/>
             <w:tcBorders>
               <w:top w:val="single" w:sz="1" w:space="0" w:color="999999"/>
               <w:left w:val="single" w:sz="1" w:space="0" w:color="999999"/>
@@ -2984,7 +3101,7 @@
         </w:tc>
         <w:tc>
           <w:tcPr>
-            <w:tcW w:w="3580" w:type="dxa"/>
+            <w:tcW w:w="5508" w:type="dxa"/>
             <w:tcBorders>
               <w:top w:val="single" w:sz="1" w:space="0" w:color="999999"/>
               <w:left w:val="single" w:sz="1" w:space="0" w:color="999999"/>
@@ -3027,7 +3144,7 @@
         </w:tc>
         <w:tc>
           <w:tcPr>
-            <w:tcW w:w="3580" w:type="dxa"/>
+            <w:tcW w:w="5508" w:type="dxa"/>
             <w:tcBorders>
               <w:top w:val="single" w:sz="1" w:space="0" w:color="999999"/>
               <w:left w:val="single" w:sz="1" w:space="0" w:color="999999"/>
@@ -3054,15 +3171,9 @@
         </w:tc>
       </w:tr>
       <w:tr>
-        <w:tblPrEx>
-          <w:tblCellMar>
-            <w:top w:w="0" w:type="dxa"/>
-            <w:bottom w:w="0" w:type="dxa"/>
-          </w:tblCellMar>
-        </w:tblPrEx>
-        <w:tc>
-          <w:tcPr>
-            <w:tcW w:w="9360" w:type="dxa"/>
+        <w:tc>
+          <w:tcPr>
+            <w:tcW w:w="14400" w:type="dxa"/>
             <w:gridSpan w:val="3"/>
             <w:tcBorders>
               <w:top w:val="single" w:sz="1" w:space="0" w:color="999999"/>
@@ -3093,15 +3204,9 @@
         </w:tc>
       </w:tr>
       <w:tr>
-        <w:tblPrEx>
-          <w:tblCellMar>
-            <w:top w:w="0" w:type="dxa"/>
-            <w:bottom w:w="0" w:type="dxa"/>
-          </w:tblCellMar>
-        </w:tblPrEx>
-        <w:tc>
-          <w:tcPr>
-            <w:tcW w:w="2200" w:type="dxa"/>
+        <w:tc>
+          <w:tcPr>
+            <w:tcW w:w="3384" w:type="dxa"/>
             <w:tcBorders>
               <w:top w:val="single" w:sz="1" w:space="0" w:color="999999"/>
               <w:left w:val="single" w:sz="1" w:space="0" w:color="999999"/>
@@ -3128,7 +3233,7 @@
         </w:tc>
         <w:tc>
           <w:tcPr>
-            <w:tcW w:w="3580" w:type="dxa"/>
+            <w:tcW w:w="5508" w:type="dxa"/>
             <w:tcBorders>
               <w:top w:val="single" w:sz="1" w:space="0" w:color="999999"/>
               <w:left w:val="single" w:sz="1" w:space="0" w:color="999999"/>
@@ -3187,7 +3292,7 @@
         </w:tc>
         <w:tc>
           <w:tcPr>
-            <w:tcW w:w="3580" w:type="dxa"/>
+            <w:tcW w:w="5508" w:type="dxa"/>
             <w:tcBorders>
               <w:top w:val="single" w:sz="1" w:space="0" w:color="999999"/>
               <w:left w:val="single" w:sz="1" w:space="0" w:color="999999"/>
@@ -3214,15 +3319,9 @@
         </w:tc>
       </w:tr>
       <w:tr>
-        <w:tblPrEx>
-          <w:tblCellMar>
-            <w:top w:w="0" w:type="dxa"/>
-            <w:bottom w:w="0" w:type="dxa"/>
-          </w:tblCellMar>
-        </w:tblPrEx>
-        <w:tc>
-          <w:tcPr>
-            <w:tcW w:w="2200" w:type="dxa"/>
+        <w:tc>
+          <w:tcPr>
+            <w:tcW w:w="3384" w:type="dxa"/>
             <w:tcBorders>
               <w:top w:val="single" w:sz="1" w:space="0" w:color="999999"/>
               <w:left w:val="single" w:sz="1" w:space="0" w:color="999999"/>
@@ -3249,7 +3348,7 @@
         </w:tc>
         <w:tc>
           <w:tcPr>
-            <w:tcW w:w="3580" w:type="dxa"/>
+            <w:tcW w:w="5508" w:type="dxa"/>
             <w:tcBorders>
               <w:top w:val="single" w:sz="1" w:space="0" w:color="999999"/>
               <w:left w:val="single" w:sz="1" w:space="0" w:color="999999"/>
@@ -3292,7 +3391,7 @@
         </w:tc>
         <w:tc>
           <w:tcPr>
-            <w:tcW w:w="3580" w:type="dxa"/>
+            <w:tcW w:w="5508" w:type="dxa"/>
             <w:tcBorders>
               <w:top w:val="single" w:sz="1" w:space="0" w:color="999999"/>
               <w:left w:val="single" w:sz="1" w:space="0" w:color="999999"/>
@@ -3319,15 +3418,9 @@
         </w:tc>
       </w:tr>
       <w:tr>
-        <w:tblPrEx>
-          <w:tblCellMar>
-            <w:top w:w="0" w:type="dxa"/>
-            <w:bottom w:w="0" w:type="dxa"/>
-          </w:tblCellMar>
-        </w:tblPrEx>
-        <w:tc>
-          <w:tcPr>
-            <w:tcW w:w="9360" w:type="dxa"/>
+        <w:tc>
+          <w:tcPr>
+            <w:tcW w:w="14400" w:type="dxa"/>
             <w:gridSpan w:val="3"/>
             <w:tcBorders>
               <w:top w:val="single" w:sz="1" w:space="0" w:color="999999"/>
@@ -3358,15 +3451,9 @@
         </w:tc>
       </w:tr>
       <w:tr>
-        <w:tblPrEx>
-          <w:tblCellMar>
-            <w:top w:w="0" w:type="dxa"/>
-            <w:bottom w:w="0" w:type="dxa"/>
-          </w:tblCellMar>
-        </w:tblPrEx>
-        <w:tc>
-          <w:tcPr>
-            <w:tcW w:w="2200" w:type="dxa"/>
+        <w:tc>
+          <w:tcPr>
+            <w:tcW w:w="3384" w:type="dxa"/>
             <w:tcBorders>
               <w:top w:val="single" w:sz="1" w:space="0" w:color="999999"/>
               <w:left w:val="single" w:sz="1" w:space="0" w:color="999999"/>
@@ -3393,7 +3480,7 @@
         </w:tc>
         <w:tc>
           <w:tcPr>
-            <w:tcW w:w="3580" w:type="dxa"/>
+            <w:tcW w:w="5508" w:type="dxa"/>
             <w:tcBorders>
               <w:top w:val="single" w:sz="1" w:space="0" w:color="999999"/>
               <w:left w:val="single" w:sz="1" w:space="0" w:color="999999"/>
@@ -3420,7 +3507,7 @@
         </w:tc>
         <w:tc>
           <w:tcPr>
-            <w:tcW w:w="3580" w:type="dxa"/>
+            <w:tcW w:w="5508" w:type="dxa"/>
             <w:tcBorders>
               <w:top w:val="single" w:sz="1" w:space="0" w:color="999999"/>
               <w:left w:val="single" w:sz="1" w:space="0" w:color="999999"/>
@@ -3447,15 +3534,9 @@
         </w:tc>
       </w:tr>
       <w:tr>
-        <w:tblPrEx>
-          <w:tblCellMar>
-            <w:top w:w="0" w:type="dxa"/>
-            <w:bottom w:w="0" w:type="dxa"/>
-          </w:tblCellMar>
-        </w:tblPrEx>
-        <w:tc>
-          <w:tcPr>
-            <w:tcW w:w="9360" w:type="dxa"/>
+        <w:tc>
+          <w:tcPr>
+            <w:tcW w:w="14400" w:type="dxa"/>
             <w:gridSpan w:val="3"/>
             <w:tcBorders>
               <w:top w:val="single" w:sz="1" w:space="0" w:color="999999"/>
@@ -3486,15 +3567,9 @@
         </w:tc>
       </w:tr>
       <w:tr>
-        <w:tblPrEx>
-          <w:tblCellMar>
-            <w:top w:w="0" w:type="dxa"/>
-            <w:bottom w:w="0" w:type="dxa"/>
-          </w:tblCellMar>
-        </w:tblPrEx>
-        <w:tc>
-          <w:tcPr>
-            <w:tcW w:w="2200" w:type="dxa"/>
+        <w:tc>
+          <w:tcPr>
+            <w:tcW w:w="3384" w:type="dxa"/>
             <w:tcBorders>
               <w:top w:val="single" w:sz="1" w:space="0" w:color="999999"/>
               <w:left w:val="single" w:sz="1" w:space="0" w:color="999999"/>
@@ -3521,7 +3596,7 @@
         </w:tc>
         <w:tc>
           <w:tcPr>
-            <w:tcW w:w="3580" w:type="dxa"/>
+            <w:tcW w:w="5508" w:type="dxa"/>
             <w:tcBorders>
               <w:top w:val="single" w:sz="1" w:space="0" w:color="999999"/>
               <w:left w:val="single" w:sz="1" w:space="0" w:color="999999"/>
@@ -3564,7 +3639,7 @@
         </w:tc>
         <w:tc>
           <w:tcPr>
-            <w:tcW w:w="3580" w:type="dxa"/>
+            <w:tcW w:w="5508" w:type="dxa"/>
             <w:tcBorders>
               <w:top w:val="single" w:sz="1" w:space="0" w:color="999999"/>
               <w:left w:val="single" w:sz="1" w:space="0" w:color="999999"/>
@@ -3591,15 +3666,9 @@
         </w:tc>
       </w:tr>
       <w:tr>
-        <w:tblPrEx>
-          <w:tblCellMar>
-            <w:top w:w="0" w:type="dxa"/>
-            <w:bottom w:w="0" w:type="dxa"/>
-          </w:tblCellMar>
-        </w:tblPrEx>
-        <w:tc>
-          <w:tcPr>
-            <w:tcW w:w="2200" w:type="dxa"/>
+        <w:tc>
+          <w:tcPr>
+            <w:tcW w:w="3384" w:type="dxa"/>
             <w:tcBorders>
               <w:top w:val="single" w:sz="1" w:space="0" w:color="999999"/>
               <w:left w:val="single" w:sz="1" w:space="0" w:color="999999"/>
@@ -3626,7 +3695,7 @@
         </w:tc>
         <w:tc>
           <w:tcPr>
-            <w:tcW w:w="3580" w:type="dxa"/>
+            <w:tcW w:w="5508" w:type="dxa"/>
             <w:tcBorders>
               <w:top w:val="single" w:sz="1" w:space="0" w:color="999999"/>
               <w:left w:val="single" w:sz="1" w:space="0" w:color="999999"/>
@@ -3669,7 +3738,7 @@
         </w:tc>
         <w:tc>
           <w:tcPr>
-            <w:tcW w:w="3580" w:type="dxa"/>
+            <w:tcW w:w="5508" w:type="dxa"/>
             <w:tcBorders>
               <w:top w:val="single" w:sz="1" w:space="0" w:color="999999"/>
               <w:left w:val="single" w:sz="1" w:space="0" w:color="999999"/>
@@ -3696,15 +3765,9 @@
         </w:tc>
       </w:tr>
       <w:tr>
-        <w:tblPrEx>
-          <w:tblCellMar>
-            <w:top w:w="0" w:type="dxa"/>
-            <w:bottom w:w="0" w:type="dxa"/>
-          </w:tblCellMar>
-        </w:tblPrEx>
-        <w:tc>
-          <w:tcPr>
-            <w:tcW w:w="2200" w:type="dxa"/>
+        <w:tc>
+          <w:tcPr>
+            <w:tcW w:w="3384" w:type="dxa"/>
             <w:tcBorders>
               <w:top w:val="single" w:sz="1" w:space="0" w:color="999999"/>
               <w:left w:val="single" w:sz="1" w:space="0" w:color="999999"/>
@@ -3731,7 +3794,7 @@
         </w:tc>
         <w:tc>
           <w:tcPr>
-            <w:tcW w:w="3580" w:type="dxa"/>
+            <w:tcW w:w="5508" w:type="dxa"/>
             <w:tcBorders>
               <w:top w:val="single" w:sz="1" w:space="0" w:color="999999"/>
               <w:left w:val="single" w:sz="1" w:space="0" w:color="999999"/>
@@ -3783,7 +3846,7 @@
         </w:tc>
         <w:tc>
           <w:tcPr>
-            <w:tcW w:w="3580" w:type="dxa"/>
+            <w:tcW w:w="5508" w:type="dxa"/>
             <w:tcBorders>
               <w:top w:val="single" w:sz="1" w:space="0" w:color="999999"/>
               <w:left w:val="single" w:sz="1" w:space="0" w:color="999999"/>
@@ -3804,7 +3867,15 @@
                 <w:sz w:val="18"/>
                 <w:szCs w:val="18"/>
               </w:rPr>
-              <w:t>Reinforces the primacy of collective/symbolic representation over individual-level representation. For your project: having one or two champions (Pressley, Miranda) may matter less than the aggregate pattern of whether carceral citizens appear in the collective representational imaginary.</w:t>
+              <w:t xml:space="preserve">Reinforces the primacy of collective/symbolic representation over individual-level representation. For your project: having one or two champions (Pressley, Miranda) may matter less than the aggregate </w:t>
+            </w:r>
+            <w:r>
+              <w:rPr>
+                <w:sz w:val="18"/>
+                <w:szCs w:val="18"/>
+              </w:rPr>
+              <w:lastRenderedPageBreak/>
+              <w:t>pattern of whether carceral citizens appear in the collective representational imaginary.</w:t>
             </w:r>
           </w:p>
         </w:tc>
@@ -3822,21 +3893,1264 @@
           <w:bCs/>
           <w:color w:val="2C3E50"/>
         </w:rPr>
-        <w:lastRenderedPageBreak/>
         <w:t>Notes on Usage</w:t>
       </w:r>
     </w:p>
     <w:p>
       <w:pPr>
         <w:spacing w:before="100"/>
-      </w:pPr>
-      <w:r>
         <w:rPr>
           <w:sz w:val="19"/>
           <w:szCs w:val="19"/>
         </w:rPr>
+      </w:pPr>
+      <w:r>
+        <w:rPr>
+          <w:sz w:val="19"/>
+          <w:szCs w:val="19"/>
+        </w:rPr>
         <w:t>Sections A–D contain citations most directly useful for your theory chapter and the "special cases" framework. Section E is relevant for research design. Sections F–G connect to your broader argument about democratic stakes. Sections H–I are methodological. Section J summarizes A&amp;C's own findings and their implications for your project.</w:t>
       </w:r>
+    </w:p>
+    <w:p>
+      <w:pPr>
+        <w:spacing w:before="100"/>
+        <w:rPr>
+          <w:sz w:val="19"/>
+          <w:szCs w:val="19"/>
+        </w:rPr>
+      </w:pPr>
+    </w:p>
+    <w:p>
+      <w:pPr>
+        <w:spacing w:before="100"/>
+        <w:rPr>
+          <w:sz w:val="19"/>
+          <w:szCs w:val="19"/>
+        </w:rPr>
+      </w:pPr>
+    </w:p>
+    <w:p>
+      <w:pPr>
+        <w:spacing w:before="100"/>
+        <w:rPr>
+          <w:sz w:val="19"/>
+          <w:szCs w:val="19"/>
+        </w:rPr>
+      </w:pPr>
+    </w:p>
+    <w:p>
+      <w:pPr>
+        <w:spacing w:before="100"/>
+        <w:rPr>
+          <w:sz w:val="19"/>
+          <w:szCs w:val="19"/>
+        </w:rPr>
+      </w:pPr>
+      <w:r>
+        <w:rPr>
+          <w:sz w:val="19"/>
+          <w:szCs w:val="19"/>
+        </w:rPr>
+        <w:t xml:space="preserve">Citations </w:t>
+      </w:r>
+    </w:p>
+    <w:p>
+      <w:pPr>
+        <w:spacing w:before="100"/>
+        <w:rPr>
+          <w:sz w:val="19"/>
+          <w:szCs w:val="19"/>
+        </w:rPr>
+      </w:pPr>
+    </w:p>
+    <w:p>
+      <w:pPr>
+        <w:spacing w:before="100"/>
+        <w:rPr>
+          <w:sz w:val="19"/>
+          <w:szCs w:val="19"/>
+        </w:rPr>
+      </w:pPr>
+      <w:r>
+        <w:rPr>
+          <w:sz w:val="19"/>
+          <w:szCs w:val="19"/>
+        </w:rPr>
+        <w:t>Check that I’ve seen before/note/add</w:t>
+      </w:r>
+    </w:p>
+    <w:p>
+      <w:pPr>
+        <w:spacing w:before="100"/>
+        <w:rPr>
+          <w:sz w:val="19"/>
+          <w:szCs w:val="19"/>
+        </w:rPr>
+      </w:pPr>
+    </w:p>
+    <w:p>
+      <w:pPr>
+        <w:spacing w:before="100"/>
+        <w:rPr>
+          <w:b/>
+          <w:bCs/>
+        </w:rPr>
+      </w:pPr>
+      <w:r>
+        <w:rPr>
+          <w:b/>
+          <w:bCs/>
+        </w:rPr>
+        <w:t>Builds greater trust in gov for historically disenfranchised</w:t>
+      </w:r>
+    </w:p>
+    <w:p>
+      <w:pPr>
+        <w:spacing w:before="100"/>
+      </w:pPr>
+      <w:r>
+        <w:t>Dovi, Suzanne. 2008. “Theorizing Women’s Representation in the United States.” In Political Women and American Democracy, edited by Christina Wolbrecht, Karen Beckwith, and Lisa Baldez. New York: Cambridge University Press.</w:t>
+      </w:r>
+    </w:p>
+    <w:p>
+      <w:pPr>
+        <w:pStyle w:val="ListParagraph"/>
+        <w:numPr>
+          <w:ilvl w:val="0"/>
+          <w:numId w:val="5"/>
+        </w:numPr>
+        <w:spacing w:before="100"/>
+      </w:pPr>
+    </w:p>
+    <w:p>
+      <w:pPr>
+        <w:spacing w:before="100"/>
+      </w:pPr>
+    </w:p>
+    <w:p>
+      <w:pPr>
+        <w:spacing w:before="100"/>
+      </w:pPr>
+      <w:r>
+        <w:t>Gay, Claudine. 2002. “Spirals of Trust? The Effect of Descriptive Representation on the Relationship between Citizens and Their Government.” American Journal of Political Science 46 (4): 717–32.</w:t>
+      </w:r>
+    </w:p>
+    <w:p>
+      <w:pPr>
+        <w:spacing w:before="100"/>
+      </w:pPr>
+    </w:p>
+    <w:p>
+      <w:pPr>
+        <w:spacing w:before="100"/>
+        <w:rPr>
+          <w:b/>
+          <w:bCs/>
+        </w:rPr>
+      </w:pPr>
+      <w:r>
+        <w:rPr>
+          <w:b/>
+          <w:bCs/>
+        </w:rPr>
+        <w:t>Inspires political efficacy</w:t>
+      </w:r>
+    </w:p>
+    <w:p>
+      <w:pPr>
+        <w:spacing w:before="100"/>
+      </w:pPr>
+      <w:r>
+        <w:t>Atkeson, Lonna Rae, and Nancy Carrillo. 2007. “More is Better: The Influence of Collective Female Descriptive Representation on External Efficacy.” Politics &amp; Gender 3 (1): 79–101.</w:t>
+      </w:r>
+    </w:p>
+    <w:p>
+      <w:pPr>
+        <w:spacing w:before="100"/>
+      </w:pPr>
+    </w:p>
+    <w:p>
+      <w:pPr>
+        <w:spacing w:before="100"/>
+      </w:pPr>
+      <w:r>
+        <w:t xml:space="preserve">Merolla, Jennifer L., </w:t>
+      </w:r>
+      <w:proofErr w:type="spellStart"/>
+      <w:r>
+        <w:t>Abbylin</w:t>
+      </w:r>
+      <w:proofErr w:type="spellEnd"/>
+      <w:r>
+        <w:t xml:space="preserve"> H. Sellers, and Derek J. Fowler. 2013. “Descriptive Representation, Political Efficacy, and African Americans in the 2008 Presidential Election.” Political Psychology 34 (6): 863–75.</w:t>
+      </w:r>
+    </w:p>
+    <w:p>
+      <w:pPr>
+        <w:spacing w:before="100"/>
+      </w:pPr>
+    </w:p>
+    <w:p>
+      <w:pPr>
+        <w:spacing w:before="100"/>
+        <w:rPr>
+          <w:b/>
+          <w:bCs/>
+        </w:rPr>
+      </w:pPr>
+      <w:r>
+        <w:rPr>
+          <w:b/>
+          <w:bCs/>
+        </w:rPr>
+        <w:t xml:space="preserve">Encourage more engagement: voting, contacted </w:t>
+      </w:r>
+      <w:proofErr w:type="spellStart"/>
+      <w:r>
+        <w:rPr>
+          <w:b/>
+          <w:bCs/>
+        </w:rPr>
+        <w:t>electeds</w:t>
+      </w:r>
+      <w:proofErr w:type="spellEnd"/>
+    </w:p>
+    <w:p>
+      <w:pPr>
+        <w:spacing w:before="100"/>
+      </w:pPr>
+      <w:r>
+        <w:t>Bowen, Daniel C., and Christopher J. Clark. 2014. “Revisiting Descriptive Representation in Congress: Assessing the Effect of Race on the Constituent-Legislator Relationship.” Political Research Quarterly 67 (3): 695–707.</w:t>
+      </w:r>
+    </w:p>
+    <w:p>
+      <w:pPr>
+        <w:spacing w:before="100"/>
+      </w:pPr>
+    </w:p>
+    <w:p>
+      <w:pPr>
+        <w:spacing w:before="100"/>
+      </w:pPr>
+      <w:r>
+        <w:lastRenderedPageBreak/>
+        <w:t xml:space="preserve">Brians, Craig L. 2005. “Women for </w:t>
+      </w:r>
+      <w:proofErr w:type="gramStart"/>
+      <w:r>
+        <w:t>Women?:</w:t>
+      </w:r>
+      <w:proofErr w:type="gramEnd"/>
+      <w:r>
+        <w:t xml:space="preserve"> Gender and Party Bias in Voting for Female Candidates.” American Politics Research 33 (3): 357–375.</w:t>
+      </w:r>
+    </w:p>
+    <w:p>
+      <w:pPr>
+        <w:spacing w:before="100"/>
+      </w:pPr>
+    </w:p>
+    <w:p>
+      <w:pPr>
+        <w:spacing w:before="100"/>
+      </w:pPr>
+      <w:r>
+        <w:t>Rocha, Rene R., Caroline J. Tolbert, Daniel C. Bowen, and Christopher J. Clark. 2010. “Race and Turnout: Does Descriptive Representation in State Legislatures Increase Minority Voting?” Political Research Quarterly 63 (4): 890–907.</w:t>
+      </w:r>
+    </w:p>
+    <w:p>
+      <w:pPr>
+        <w:spacing w:before="100"/>
+      </w:pPr>
+    </w:p>
+    <w:p>
+      <w:pPr>
+        <w:spacing w:before="100"/>
+      </w:pPr>
+      <w:r>
+        <w:rPr>
+          <w:b/>
+          <w:bCs/>
+        </w:rPr>
+        <w:t>Group members in high level and visible political offices can inspire more running for low level office</w:t>
+      </w:r>
+      <w:r>
+        <w:t xml:space="preserve"> e</w:t>
+      </w:r>
+      <w:r>
+        <w:rPr>
+          <w:highlight w:val="green"/>
+        </w:rPr>
+        <w:t xml:space="preserve">mphasis on visibility – some benefits of </w:t>
+      </w:r>
+      <w:proofErr w:type="spellStart"/>
+      <w:r>
+        <w:rPr>
+          <w:highlight w:val="green"/>
+        </w:rPr>
+        <w:t>DRep</w:t>
+      </w:r>
+      <w:proofErr w:type="spellEnd"/>
+      <w:r>
+        <w:rPr>
+          <w:highlight w:val="green"/>
+        </w:rPr>
+        <w:t xml:space="preserve"> may not hold in case of legislators who do not disclose</w:t>
+      </w:r>
+      <w:r>
+        <w:t xml:space="preserve"> </w:t>
+      </w:r>
+    </w:p>
+    <w:p>
+      <w:pPr>
+        <w:spacing w:before="100"/>
+      </w:pPr>
+    </w:p>
+    <w:p>
+      <w:pPr>
+        <w:spacing w:before="100"/>
+      </w:pPr>
+      <w:r>
+        <w:t xml:space="preserve">Ladam, Christina, Jeffrey J. Harden, and Jason H. </w:t>
+      </w:r>
+      <w:proofErr w:type="spellStart"/>
+      <w:r>
+        <w:t>Windett</w:t>
+      </w:r>
+      <w:proofErr w:type="spellEnd"/>
+      <w:r>
+        <w:t>. 2018. “Prominent Role Models: High-profile Female Politicians and the Emergence of Women as Candidates for Public Office.” American Journal of Political Science 62 (2): 369–81.</w:t>
+      </w:r>
+    </w:p>
+    <w:p>
+      <w:pPr>
+        <w:spacing w:before="100"/>
+      </w:pPr>
+    </w:p>
+    <w:p>
+      <w:pPr>
+        <w:spacing w:before="100"/>
+        <w:rPr>
+          <w:b/>
+          <w:bCs/>
+        </w:rPr>
+      </w:pPr>
+      <w:r>
+        <w:rPr>
+          <w:b/>
+          <w:bCs/>
+        </w:rPr>
+        <w:t>Descriptive representatives add their groups’ concerns to the agenda by sponsoring new legislation</w:t>
+      </w:r>
+    </w:p>
+    <w:p>
+      <w:r>
+        <w:t>Bratton, Kathleen A. 2005. “Critical Mass Theory Revisited: The Behavior and Success of Token Women in State Legislatures.” Politics &amp; Gender 1 (1): 97–125.</w:t>
+      </w:r>
+    </w:p>
+    <w:p/>
+    <w:p>
+      <w:r>
+        <w:t>Bratton, Kathleen A., and Kerry L. Haynie. 1999. “Agenda Setting and Legislative Success in State Legislatures: The Effects of Gender and Race.” Journal of Politics 61 (3): 658–79.</w:t>
+      </w:r>
+    </w:p>
+    <w:p>
+      <w:pPr>
+        <w:spacing w:before="100"/>
+      </w:pPr>
+    </w:p>
+    <w:p>
+      <w:proofErr w:type="spellStart"/>
+      <w:r>
+        <w:t>Lowande</w:t>
+      </w:r>
+      <w:proofErr w:type="spellEnd"/>
+      <w:r>
+        <w:t>, Kenneth, Melinda Ritchie, and Erinn Lauterbach. 2019. “Descriptive and Substantive Representation in Congress: Evidence from 80,000 Congressional Inquiries.” American Journal of Political Science 63 (3): 644–59.</w:t>
+      </w:r>
+    </w:p>
+    <w:p>
+      <w:pPr>
+        <w:spacing w:before="100"/>
+      </w:pPr>
+    </w:p>
+    <w:p>
+      <w:pPr>
+        <w:spacing w:before="100"/>
+        <w:rPr>
+          <w:b/>
+          <w:bCs/>
+        </w:rPr>
+      </w:pPr>
+      <w:proofErr w:type="spellStart"/>
+      <w:r>
+        <w:rPr>
+          <w:b/>
+          <w:bCs/>
+        </w:rPr>
+        <w:t>Drep</w:t>
+      </w:r>
+      <w:proofErr w:type="spellEnd"/>
+      <w:r>
+        <w:rPr>
+          <w:b/>
+          <w:bCs/>
+        </w:rPr>
+        <w:t xml:space="preserve"> -&gt;</w:t>
+      </w:r>
+      <w:r>
+        <w:rPr>
+          <w:b/>
+          <w:bCs/>
+        </w:rPr>
+        <w:t>I</w:t>
+      </w:r>
+      <w:r>
+        <w:rPr>
+          <w:b/>
+          <w:bCs/>
+        </w:rPr>
+        <w:t>ntervening more into the bureaucracy on behalf of group members</w:t>
+      </w:r>
+    </w:p>
+    <w:p/>
+    <w:p>
+      <w:r>
+        <w:t>Minta, Michael D. 2009. “Legislative Oversight and the Substantive Representation of Black and Latino Interests in Congress.” Legislative Studies Quarterly 34 (2): 193–218.</w:t>
+      </w:r>
+    </w:p>
+    <w:p>
+      <w:pPr>
+        <w:spacing w:before="100"/>
+        <w:rPr>
+          <w:b/>
+          <w:bCs/>
+        </w:rPr>
+      </w:pPr>
+    </w:p>
+    <w:p>
+      <w:r>
+        <w:t>Minta, Michael D. 2009. “Legislative Oversight and the Substantive Representation of Black and Latino Interests in Congress.” Legislative Studies Quarterly 34 (2): 193–218.</w:t>
+      </w:r>
+    </w:p>
+    <w:p>
+      <w:pPr>
+        <w:spacing w:before="100"/>
+        <w:rPr>
+          <w:b/>
+          <w:bCs/>
+        </w:rPr>
+      </w:pPr>
+    </w:p>
+    <w:p>
+      <w:pPr>
+        <w:spacing w:before="100"/>
+        <w:rPr>
+          <w:b/>
+          <w:bCs/>
+        </w:rPr>
+      </w:pPr>
+      <w:r>
+        <w:rPr>
+          <w:b/>
+          <w:bCs/>
+        </w:rPr>
+        <w:t>S</w:t>
+      </w:r>
+      <w:r>
+        <w:rPr>
+          <w:b/>
+          <w:bCs/>
+        </w:rPr>
+        <w:t>topping proposals with negative consequences for their group from being enacted into law</w:t>
+      </w:r>
+    </w:p>
+    <w:p>
+      <w:pPr>
+        <w:spacing w:before="100"/>
+      </w:pPr>
+      <w:r>
+        <w:t xml:space="preserve">(come back to) </w:t>
+      </w:r>
+      <w:r>
+        <w:t>Carlson, Kirsten M. 2022. “Beyond Descriptive Representation: American Indian Opposition to Federal Legislation.” Journal of Race, Ethnicity and Politics 7 (1): 65–89.</w:t>
+      </w:r>
+    </w:p>
+    <w:p>
+      <w:pPr>
+        <w:spacing w:before="100"/>
+      </w:pPr>
+    </w:p>
+    <w:p>
+      <w:r>
+        <w:lastRenderedPageBreak/>
+        <w:t xml:space="preserve">(come back to) </w:t>
+      </w:r>
+      <w:r>
+        <w:t>Haider-Markel, Donald P. 2010. Out and Running: Gay and Lesbian Candidates, Elections, and Policy Representation. Washington, D.C.: Georgetown University Press.</w:t>
+      </w:r>
+    </w:p>
+    <w:p/>
+    <w:p>
+      <w:r>
+        <w:t>Haider-Markel, Donald P. 2007. “Representation and Backlash: The Positive and Negative Influence of Descriptive Representation.” Legislative Studies Quarterly 32 (1): 107–33.</w:t>
+      </w:r>
+    </w:p>
+    <w:p>
+      <w:pPr>
+        <w:spacing w:before="100"/>
+        <w:rPr>
+          <w:b/>
+          <w:bCs/>
+        </w:rPr>
+      </w:pPr>
+    </w:p>
+    <w:p>
+      <w:pPr>
+        <w:spacing w:before="100"/>
+      </w:pPr>
+      <w:r>
+        <w:t xml:space="preserve">Schroedel, Jean Reith, and </w:t>
+      </w:r>
+      <w:proofErr w:type="spellStart"/>
+      <w:r>
+        <w:t>Artour</w:t>
+      </w:r>
+      <w:proofErr w:type="spellEnd"/>
+      <w:r>
+        <w:t xml:space="preserve"> Aslanian. 2017. “A Case Study of Descriptive Representation: The Experience of Native American Elected Officials in South Dakota.” American Indian Quarterly 41 (3): 250–86.</w:t>
+      </w:r>
+    </w:p>
+    <w:p>
+      <w:pPr>
+        <w:spacing w:before="100"/>
+      </w:pPr>
+    </w:p>
+    <w:p>
+      <w:pPr>
+        <w:spacing w:before="100"/>
+        <w:rPr>
+          <w:b/>
+          <w:bCs/>
+        </w:rPr>
+      </w:pPr>
+      <w:r>
+        <w:rPr>
+          <w:b/>
+          <w:bCs/>
+        </w:rPr>
+        <w:t xml:space="preserve">“Helps to </w:t>
+      </w:r>
+      <w:proofErr w:type="spellStart"/>
+      <w:r>
+        <w:rPr>
+          <w:b/>
+          <w:bCs/>
+        </w:rPr>
+        <w:t>icorporate</w:t>
+      </w:r>
+      <w:proofErr w:type="spellEnd"/>
+      <w:r>
+        <w:rPr>
+          <w:b/>
+          <w:bCs/>
+        </w:rPr>
+        <w:t xml:space="preserve"> marginalized groups into government by providing an avenue for the group to advance their own policy interests using the power of the elected office” </w:t>
+      </w:r>
+    </w:p>
+    <w:p>
+      <w:pPr>
+        <w:spacing w:before="100"/>
+        <w:rPr>
+          <w:b/>
+          <w:bCs/>
+        </w:rPr>
+      </w:pPr>
+    </w:p>
+    <w:p>
+      <w:pPr>
+        <w:spacing w:before="100"/>
+      </w:pPr>
+      <w:r>
+        <w:t>Reingold, Beth. 2008. “Women as Officeholders: Linking Descriptive and Substantive Representation.” In Political Women and American Democracy, edited by Christina Wolbrecht, Karen Beckwith, and Lisa Baldez. New York: Cambridge University Press.</w:t>
+      </w:r>
+    </w:p>
+    <w:p>
+      <w:pPr>
+        <w:spacing w:before="100"/>
+      </w:pPr>
+    </w:p>
+    <w:p>
+      <w:r>
+        <w:t>Barnello, Michelle A., and Kathleen A. Bratton. 2007. “Bridging the Gender Gap in Bill Sponsorship.” Legislative Studies Quarterly 32 (3): 449–474.</w:t>
+      </w:r>
+    </w:p>
+    <w:p>
+      <w:r>
+        <w:t>Bratton, Kathleen A. 2005. “Critical Mass Theory Revisited: The Behavior and Success of Token Women in State Legislatures.” Politics &amp; Gender 1 (1): 97–125.</w:t>
+      </w:r>
+    </w:p>
+    <w:p>
+      <w:r>
+        <w:t>Bratton, Kathleen A., and Kerry L. Haynie. 1999. “Agenda Setting and Legislative Success in State Legislatures: The Effects of Gender and Race.” Journal of Politics 61 (3): 658–79.</w:t>
+      </w:r>
+    </w:p>
+    <w:p>
+      <w:pPr>
+        <w:spacing w:before="100"/>
+        <w:rPr>
+          <w:b/>
+          <w:bCs/>
+        </w:rPr>
+      </w:pPr>
+    </w:p>
+    <w:p>
+      <w:pPr>
+        <w:spacing w:before="100"/>
+        <w:rPr>
+          <w:b/>
+          <w:bCs/>
+        </w:rPr>
+      </w:pPr>
+      <w:r>
+        <w:rPr>
+          <w:b/>
+          <w:bCs/>
+        </w:rPr>
+        <w:t xml:space="preserve">Advance legislative interests via process </w:t>
+      </w:r>
+    </w:p>
+    <w:p>
+      <w:pPr>
+        <w:spacing w:before="100"/>
+        <w:rPr>
+          <w:b/>
+          <w:bCs/>
+        </w:rPr>
+      </w:pPr>
+    </w:p>
+    <w:p>
+      <w:pPr>
+        <w:spacing w:before="100"/>
+        <w:rPr>
+          <w:b/>
+          <w:bCs/>
+        </w:rPr>
+      </w:pPr>
+    </w:p>
+    <w:p>
+      <w:pPr>
+        <w:spacing w:before="100"/>
+        <w:rPr>
+          <w:b/>
+          <w:bCs/>
+        </w:rPr>
+      </w:pPr>
+      <w:r>
+        <w:rPr>
+          <w:b/>
+          <w:bCs/>
+        </w:rPr>
+        <w:t>Represent constituencies in ways beyond legislation</w:t>
+      </w:r>
+    </w:p>
+    <w:p>
+      <w:pPr>
+        <w:spacing w:before="100"/>
+      </w:pPr>
+      <w:r>
+        <w:t>Canon, David T. 1999. Race, Redistricting, and Representation: The Unintended Consequences of Black Majority Districts. Chicago: University of Chicago Press.</w:t>
+      </w:r>
+    </w:p>
+    <w:p>
+      <w:pPr>
+        <w:spacing w:before="100"/>
+      </w:pPr>
+      <w:r>
+        <w:t>Carroll, Susan J. 2006. “The Committee Assignments of State Legislators: An Under-explored Link in Understanding Gender Differences.” In Paper presented at the Women in Politics: Seeking Office and Making Policy Conference sponsored by the Center for Politics (University of Virginia) and the Institute of Governmental Studies (University of California, Berkeley), Berkeley, CA, June 9-10, 2006.</w:t>
+      </w:r>
+    </w:p>
+    <w:p>
+      <w:pPr>
+        <w:spacing w:before="100"/>
+        <w:rPr>
+          <w:b/>
+          <w:bCs/>
+        </w:rPr>
+      </w:pPr>
+      <w:r>
+        <w:t>Hall, Richard L. 1996. Participation in Congress. New Haven, CT: Yale University Press.</w:t>
+      </w:r>
+      <w:r>
+        <w:rPr>
+          <w:b/>
+          <w:bCs/>
+        </w:rPr>
+        <w:t xml:space="preserve"> </w:t>
+      </w:r>
+    </w:p>
+    <w:p>
+      <w:pPr>
+        <w:spacing w:before="100"/>
+      </w:pPr>
+    </w:p>
+    <w:p>
+      <w:pPr>
+        <w:spacing w:before="100"/>
+        <w:rPr>
+          <w:b/>
+          <w:bCs/>
+        </w:rPr>
+      </w:pPr>
+      <w:r>
+        <w:rPr>
+          <w:b/>
+          <w:bCs/>
+        </w:rPr>
+        <w:lastRenderedPageBreak/>
+        <w:t xml:space="preserve">Non-group members who represent significant populations sometimes do sponsor legislation benefiting group, but some evidence group members are more prolific (Q: Is this </w:t>
+      </w:r>
+      <w:proofErr w:type="gramStart"/>
+      <w:r>
+        <w:rPr>
+          <w:b/>
+          <w:bCs/>
+        </w:rPr>
+        <w:t>more true</w:t>
+      </w:r>
+      <w:proofErr w:type="gramEnd"/>
+      <w:r>
+        <w:rPr>
+          <w:b/>
+          <w:bCs/>
+        </w:rPr>
+        <w:t xml:space="preserve"> for identity like race or gender than poverty re: Miller? Or does she not even look at that)</w:t>
+      </w:r>
+    </w:p>
+    <w:p>
+      <w:pPr>
+        <w:spacing w:before="100"/>
+      </w:pPr>
+      <w:r>
+        <w:t>Barnello, Michelle A., and Kathleen A. Bratton. 2007. “Bridging the Gender Gap in Bill Sponsorship.” Legislative Studies Quarterly 32 (3): 449–474.</w:t>
+      </w:r>
+    </w:p>
+    <w:p>
+      <w:pPr>
+        <w:spacing w:before="100"/>
+      </w:pPr>
+    </w:p>
+    <w:p>
+      <w:pPr>
+        <w:spacing w:before="100"/>
+      </w:pPr>
+      <w:r>
+        <w:t xml:space="preserve">Hansen, Eric R., and Sarah A. </w:t>
+      </w:r>
+      <w:proofErr w:type="spellStart"/>
+      <w:r>
+        <w:t>Treul</w:t>
+      </w:r>
+      <w:proofErr w:type="spellEnd"/>
+      <w:r>
+        <w:t>. 2015. “The Symbolic and Substantive Representation of LGB Americans in the U.S. House.” Journal of Politics 77 (4): 955–67.</w:t>
+      </w:r>
+    </w:p>
+    <w:p>
+      <w:pPr>
+        <w:spacing w:before="100"/>
+      </w:pPr>
+      <w:r>
+        <w:t xml:space="preserve">Saraceno, Joseph, Eric R. Hansen, and Sarah A. </w:t>
+      </w:r>
+      <w:proofErr w:type="spellStart"/>
+      <w:r>
+        <w:t>Treul</w:t>
+      </w:r>
+      <w:proofErr w:type="spellEnd"/>
+      <w:r>
+        <w:t>. 2021. “Reevaluating the Substantive Representation of Lesbian, Gay, and Bisexual Americans: A Multiverse Analysis.” The Journal of Politics 83 (4): 1837–43.</w:t>
+      </w:r>
+    </w:p>
+    <w:p>
+      <w:pPr>
+        <w:spacing w:before="100"/>
+      </w:pPr>
+    </w:p>
+    <w:p>
+      <w:pPr>
+        <w:spacing w:before="100"/>
+        <w:rPr>
+          <w:b/>
+          <w:bCs/>
+        </w:rPr>
+      </w:pPr>
+      <w:r>
+        <w:rPr>
+          <w:b/>
+          <w:bCs/>
+        </w:rPr>
+        <w:t>“W</w:t>
+      </w:r>
+      <w:r>
+        <w:rPr>
+          <w:b/>
+          <w:bCs/>
+        </w:rPr>
+        <w:t>hen it comes to voting on related legislation, group members are more likely to vote in favor of bills advancing group interests, though there has been some debate over whether group membership affects voting patterns beyond partisanship</w:t>
+      </w:r>
+      <w:r>
+        <w:rPr>
+          <w:b/>
+          <w:bCs/>
+        </w:rPr>
+        <w:t>” (310)</w:t>
+      </w:r>
+    </w:p>
+    <w:p>
+      <w:pPr>
+        <w:spacing w:before="100"/>
+        <w:rPr>
+          <w:b/>
+          <w:bCs/>
+        </w:rPr>
+      </w:pPr>
+    </w:p>
+    <w:p>
+      <w:pPr>
+        <w:spacing w:before="100"/>
+      </w:pPr>
+      <w:r>
+        <w:t>Grose, Christian R. 2011. Congress in Black and White: Race and Representation in Washington and at Home. New York: Cambridge University Press.</w:t>
+      </w:r>
+    </w:p>
+    <w:p>
+      <w:pPr>
+        <w:spacing w:before="100"/>
+      </w:pPr>
+      <w:r>
+        <w:t>Lublin, David. 1997. The Paradox of Representation: Racial Gerrymandering and Minority Interests in Congress. Princeton, NJ: Princeton University Press.</w:t>
+      </w:r>
+    </w:p>
+    <w:p>
+      <w:pPr>
+        <w:spacing w:before="100"/>
+      </w:pPr>
+    </w:p>
+    <w:p>
+      <w:pPr>
+        <w:spacing w:before="100"/>
+        <w:rPr>
+          <w:b/>
+          <w:bCs/>
+        </w:rPr>
+      </w:pPr>
+      <w:r>
+        <w:rPr>
+          <w:b/>
+          <w:bCs/>
+        </w:rPr>
+        <w:t>Success in passing legislation</w:t>
+      </w:r>
+    </w:p>
+    <w:p>
+      <w:pPr>
+        <w:spacing w:before="100"/>
+      </w:pPr>
+      <w:proofErr w:type="gramStart"/>
+      <w:r>
+        <w:t>“..</w:t>
+      </w:r>
+      <w:proofErr w:type="gramEnd"/>
+      <w:r>
+        <w:t>d</w:t>
+      </w:r>
+      <w:r>
+        <w:t>escriptive representatives are more active on legislation promoting their group’s interest, the results are mixed when scholars consider whether descriptive representatives are more successful in advancing it.</w:t>
+      </w:r>
+      <w:r>
+        <w:t>”</w:t>
+      </w:r>
+    </w:p>
+    <w:p>
+      <w:pPr>
+        <w:spacing w:before="100"/>
+      </w:pPr>
+    </w:p>
+    <w:p>
+      <w:pPr>
+        <w:spacing w:before="100"/>
+        <w:ind w:left="720"/>
+      </w:pPr>
+      <w:r>
+        <w:t xml:space="preserve">Bratton and Haynie (1999), for example, find that women legislators are more effective than men passing legislation important to women, but that Black legislators are less effective than white legislators passing legislation important to Black Americans. On policy innovation, Nickelson and Jansa (2023) demonstrate that women </w:t>
+      </w:r>
+      <w:proofErr w:type="gramStart"/>
+      <w:r>
+        <w:t>are able to</w:t>
+      </w:r>
+      <w:proofErr w:type="gramEnd"/>
+      <w:r>
+        <w:t xml:space="preserve"> produce more unique policy language in state legislatures, regardless of critical mass, but that the results are inconclusive for Black, Latin(o/a/x), and Native American legislators.</w:t>
+      </w:r>
+    </w:p>
+    <w:p>
+      <w:pPr>
+        <w:spacing w:before="100"/>
+      </w:pPr>
+      <w:r>
+        <w:t>Bratton, Kathleen A., and Kerry L. Haynie. 1999. “Agenda Setting and Legislative Success in State Legislatures: The Effects of Gender and Race.” Journal of Politics 61 (3): 658–79.</w:t>
+      </w:r>
+    </w:p>
+    <w:p>
+      <w:pPr>
+        <w:pStyle w:val="ListParagraph"/>
+        <w:numPr>
+          <w:ilvl w:val="0"/>
+          <w:numId w:val="4"/>
+        </w:numPr>
+        <w:spacing w:before="100"/>
+      </w:pPr>
+      <w:r>
+        <w:t>Black sponsored legislation lower success rates than white sponsored bills in state legislatures</w:t>
+      </w:r>
+    </w:p>
+    <w:p>
+      <w:pPr>
+        <w:spacing w:before="100"/>
+        <w:rPr>
+          <w:b/>
+          <w:bCs/>
+        </w:rPr>
+      </w:pPr>
+    </w:p>
+    <w:p>
+      <w:pPr>
+        <w:pStyle w:val="ListParagraph"/>
+        <w:numPr>
+          <w:ilvl w:val="0"/>
+          <w:numId w:val="2"/>
+        </w:numPr>
+        <w:spacing w:before="100"/>
+      </w:pPr>
+      <w:r>
+        <w:t>Tied</w:t>
+      </w:r>
+      <w:r>
+        <w:t xml:space="preserve"> more to legislative influence and institutional position (sedimented!) than group membership </w:t>
+      </w:r>
+    </w:p>
+    <w:p>
+      <w:pPr>
+        <w:pStyle w:val="ListParagraph"/>
+        <w:numPr>
+          <w:ilvl w:val="1"/>
+          <w:numId w:val="2"/>
+        </w:numPr>
+        <w:spacing w:before="100"/>
+      </w:pPr>
+      <w:r>
+        <w:lastRenderedPageBreak/>
+        <w:t>Senk, Kaitlin. 2021. “Are Women Less Effective at Passing Bills? Exploring the Direct and Indirect Effect of Gender.” Legislative Studies Quarterly 46 (3): 791–815.</w:t>
+      </w:r>
+    </w:p>
+    <w:p>
+      <w:pPr>
+        <w:pStyle w:val="ListParagraph"/>
+        <w:numPr>
+          <w:ilvl w:val="1"/>
+          <w:numId w:val="2"/>
+        </w:numPr>
+        <w:spacing w:before="100"/>
+      </w:pPr>
+      <w:proofErr w:type="spellStart"/>
+      <w:r>
+        <w:t>Jeydel</w:t>
+      </w:r>
+      <w:proofErr w:type="spellEnd"/>
+      <w:r>
+        <w:t>, Alana, and Andrew J. Taylor. 2003. “Are Women Legislators Less Effective? Evidence from the US House in the 103rd-105th Congress.” Political Research Quarterly 56 (1): 19–27.</w:t>
+      </w:r>
+    </w:p>
+    <w:p>
+      <w:pPr>
+        <w:pStyle w:val="ListParagraph"/>
+        <w:numPr>
+          <w:ilvl w:val="0"/>
+          <w:numId w:val="2"/>
+        </w:numPr>
+        <w:spacing w:before="100"/>
+      </w:pPr>
+      <w:r>
+        <w:t xml:space="preserve">Or sedimentation for real – “legacies of marginalization could also influence interactions between colleagues and shape institutional practices” </w:t>
+      </w:r>
+    </w:p>
+    <w:p>
+      <w:pPr>
+        <w:pStyle w:val="ListParagraph"/>
+        <w:numPr>
+          <w:ilvl w:val="1"/>
+          <w:numId w:val="2"/>
+        </w:numPr>
+        <w:spacing w:before="100"/>
+      </w:pPr>
+      <w:r>
+        <w:t xml:space="preserve">Hawkesworth, Mary. 2003. “Congressional Enactments of </w:t>
+      </w:r>
+      <w:proofErr w:type="spellStart"/>
+      <w:r>
+        <w:t>RaceGender</w:t>
+      </w:r>
+      <w:proofErr w:type="spellEnd"/>
+      <w:r>
+        <w:t>: Toward a Theory of Raced–Gendered Institutions.” American Political Science Review 97 (4): 529–50.</w:t>
+      </w:r>
+    </w:p>
+    <w:p>
+      <w:pPr>
+        <w:pStyle w:val="ListParagraph"/>
+        <w:numPr>
+          <w:ilvl w:val="2"/>
+          <w:numId w:val="2"/>
+        </w:numPr>
+        <w:spacing w:before="100"/>
+      </w:pPr>
+      <w:r>
+        <w:t xml:space="preserve">Racialized institutions </w:t>
+      </w:r>
+    </w:p>
+    <w:p>
+      <w:pPr>
+        <w:pStyle w:val="ListParagraph"/>
+        <w:numPr>
+          <w:ilvl w:val="3"/>
+          <w:numId w:val="2"/>
+        </w:numPr>
+        <w:spacing w:before="100"/>
+      </w:pPr>
+      <w:r>
+        <w:t>Racial polarization conditions the direction and strength of descriptive representation</w:t>
+      </w:r>
+    </w:p>
+    <w:p>
+      <w:pPr>
+        <w:pStyle w:val="ListParagraph"/>
+        <w:numPr>
+          <w:ilvl w:val="4"/>
+          <w:numId w:val="2"/>
+        </w:numPr>
+        <w:spacing w:before="100"/>
+      </w:pPr>
+      <w:r>
+        <w:t xml:space="preserve">Racially polarized environments </w:t>
+      </w:r>
+      <w:r>
+        <w:t>mean no coalitions to build</w:t>
+      </w:r>
+    </w:p>
+    <w:p>
+      <w:pPr>
+        <w:pStyle w:val="ListParagraph"/>
+        <w:numPr>
+          <w:ilvl w:val="4"/>
+          <w:numId w:val="2"/>
+        </w:numPr>
+        <w:spacing w:before="100"/>
+      </w:pPr>
+      <w:r>
+        <w:t>Reduces racial minorities influence within legislative body</w:t>
+      </w:r>
+    </w:p>
+    <w:p>
+      <w:pPr>
+        <w:pStyle w:val="ListParagraph"/>
+        <w:numPr>
+          <w:ilvl w:val="0"/>
+          <w:numId w:val="2"/>
+        </w:numPr>
+        <w:spacing w:before="100"/>
+      </w:pPr>
+      <w:r>
+        <w:t>“De</w:t>
+      </w:r>
+      <w:r>
+        <w:t>scriptive representatives could encounter overt backlash from colleagues who perceive their opponents as accruing too much power, actively working to undermine the descriptive representatives’ agenda</w:t>
+      </w:r>
+      <w:r>
+        <w:t>”</w:t>
+      </w:r>
+    </w:p>
+    <w:p>
+      <w:pPr>
+        <w:pStyle w:val="ListParagraph"/>
+        <w:numPr>
+          <w:ilvl w:val="1"/>
+          <w:numId w:val="2"/>
+        </w:numPr>
+        <w:spacing w:before="100"/>
+      </w:pPr>
+      <w:r>
+        <w:t>Haider-Markel, Donald P. 2007. “Representation and Backlash: The Positive and Negative Influence of Descriptive Representation.” Legislative Studies Quarterly 32 (1): 107–33.</w:t>
+      </w:r>
+    </w:p>
+    <w:p>
+      <w:pPr>
+        <w:pStyle w:val="ListParagraph"/>
+        <w:numPr>
+          <w:ilvl w:val="1"/>
+          <w:numId w:val="2"/>
+        </w:numPr>
+        <w:spacing w:before="100"/>
+      </w:pPr>
+      <w:proofErr w:type="spellStart"/>
+      <w:r>
+        <w:t>Preuhs</w:t>
+      </w:r>
+      <w:proofErr w:type="spellEnd"/>
+      <w:r>
+        <w:t>, Robert R. 2006. “The Conditional Effects of Minority Descriptive Representation: Black Legislators and Policy Influence in the American States.” Journal of Politics 68 (3): 585–99.</w:t>
+      </w:r>
+    </w:p>
+    <w:p>
+      <w:pPr>
+        <w:spacing w:before="100"/>
+        <w:rPr>
+          <w:b/>
+          <w:bCs/>
+        </w:rPr>
+      </w:pPr>
+      <w:r>
+        <w:rPr>
+          <w:b/>
+          <w:bCs/>
+        </w:rPr>
+        <w:t>“…c</w:t>
+      </w:r>
+      <w:r>
+        <w:rPr>
+          <w:b/>
+          <w:bCs/>
+        </w:rPr>
+        <w:t xml:space="preserve">olleagues (particularly </w:t>
+      </w:r>
+      <w:proofErr w:type="spellStart"/>
+      <w:r>
+        <w:rPr>
+          <w:b/>
+          <w:bCs/>
+        </w:rPr>
+        <w:t>copartisans</w:t>
+      </w:r>
+      <w:proofErr w:type="spellEnd"/>
+      <w:r>
+        <w:rPr>
+          <w:b/>
+          <w:bCs/>
+        </w:rPr>
+        <w:t>) could view a group member as having greater expertise on the issues facing the group and defer. Over time, these legislators may be seen as de facto experts, a trusted source for information related to the group’s affairs</w:t>
+      </w:r>
+      <w:r>
+        <w:rPr>
+          <w:b/>
+          <w:bCs/>
+        </w:rPr>
+        <w:t>” (see Weissert 1991)</w:t>
+      </w:r>
+    </w:p>
+    <w:p>
+      <w:pPr>
+        <w:spacing w:before="100"/>
+      </w:pPr>
+      <w:r>
+        <w:t>Weissert, Carol S. 1991. “Issue Salience and State Legislative Effectiveness.” Legislative Studies Quarterly 16 (4): 509–520.</w:t>
+      </w:r>
+    </w:p>
+    <w:p>
+      <w:pPr>
+        <w:spacing w:before="100"/>
+      </w:pPr>
+    </w:p>
+    <w:p>
+      <w:pPr>
+        <w:spacing w:before="100"/>
+        <w:rPr>
+          <w:b/>
+          <w:bCs/>
+        </w:rPr>
+      </w:pPr>
+      <w:r>
+        <w:rPr>
+          <w:b/>
+          <w:bCs/>
+        </w:rPr>
+        <w:t>“. . . null/negative findings between (a) representation and policy outcomes benefiting blacks or (b) subjective evaluations of black legislative influence”</w:t>
+      </w:r>
+    </w:p>
+    <w:p>
+      <w:pPr>
+        <w:pStyle w:val="ListParagraph"/>
+        <w:numPr>
+          <w:ilvl w:val="0"/>
+          <w:numId w:val="3"/>
+        </w:numPr>
+        <w:spacing w:before="100"/>
+        <w:rPr>
+          <w:b/>
+          <w:bCs/>
+        </w:rPr>
+      </w:pPr>
+      <w:r>
+        <w:t>Critzer 1998 (a)</w:t>
+      </w:r>
+    </w:p>
+    <w:p>
+      <w:pPr>
+        <w:pStyle w:val="ListParagraph"/>
+        <w:numPr>
+          <w:ilvl w:val="0"/>
+          <w:numId w:val="3"/>
+        </w:numPr>
+        <w:spacing w:before="100"/>
+        <w:rPr>
+          <w:b/>
+          <w:bCs/>
+        </w:rPr>
+      </w:pPr>
+      <w:r>
+        <w:t>Nelson 1991 (a)</w:t>
+      </w:r>
+    </w:p>
+    <w:p>
+      <w:pPr>
+        <w:pStyle w:val="ListParagraph"/>
+        <w:numPr>
+          <w:ilvl w:val="0"/>
+          <w:numId w:val="3"/>
+        </w:numPr>
+        <w:spacing w:before="100"/>
+        <w:rPr>
+          <w:b/>
+          <w:bCs/>
+        </w:rPr>
+      </w:pPr>
+      <w:r>
+        <w:t>Hedge, Button and Spear 1996 (b)</w:t>
+      </w:r>
+    </w:p>
+    <w:p>
+      <w:pPr>
+        <w:spacing w:before="100"/>
+        <w:rPr>
+          <w:b/>
+          <w:bCs/>
+        </w:rPr>
+      </w:pPr>
+    </w:p>
+    <w:p>
+      <w:pPr>
+        <w:spacing w:before="100"/>
+      </w:pPr>
     </w:p>
     <w:sectPr>
       <w:pgSz w:w="15840" w:h="12240"/>
@@ -3851,6 +5165,343 @@
 <file path=word/numbering.xml><?xml version="1.0" encoding="utf-8"?>
 <w:numbering xmlns:wpc="http://schemas.microsoft.com/office/word/2010/wordprocessingCanvas" xmlns:cx="http://schemas.microsoft.com/office/drawing/2014/chartex" xmlns:cx1="http://schemas.microsoft.com/office/drawing/2015/9/8/chartex" xmlns:cx2="http://schemas.microsoft.com/office/drawing/2015/10/21/chartex" xmlns:cx3="http://schemas.microsoft.com/office/drawing/2016/5/9/chartex" xmlns:cx4="http://schemas.microsoft.com/office/drawing/2016/5/10/chartex" xmlns:cx5="http://schemas.microsoft.com/office/drawing/2016/5/11/chartex" xmlns:cx6="http://schemas.microsoft.com/office/drawing/2016/5/12/chartex" xmlns:cx7="http://schemas.microsoft.com/office/drawing/2016/5/13/chartex" xmlns:cx8="http://schemas.microsoft.com/office/drawing/2016/5/14/chartex" xmlns:mc="http://schemas.openxmlformats.org/markup-compatibility/2006" xmlns:aink="http://schemas.microsoft.com/office/drawing/2016/ink" xmlns:am3d="http://schemas.microsoft.com/office/drawing/2017/model3d" xmlns:o="urn:schemas-microsoft-com:office:office" xmlns:oel="http://schemas.microsoft.com/office/2019/extlst" xmlns:r="http://schemas.openxmlformats.org/officeDocument/2006/relationships" xmlns:m="http://schemas.openxmlformats.org/officeDocument/2006/math" xmlns:v="urn:schemas-microsoft-com:vml" xmlns:wp14="http://schemas.microsoft.com/office/word/2010/wordprocessingDrawing" xmlns:wp="http://schemas.openxmlformats.org/drawingml/2006/wordprocessingDrawing" xmlns:w10="urn:schemas-microsoft-com:office:word" xmlns:w="http://schemas.openxmlformats.org/wordprocessingml/2006/main" xmlns:w14="http://schemas.microsoft.com/office/word/2010/wordml" xmlns:w15="http://schemas.microsoft.com/office/word/2012/wordml" xmlns:w16cex="http://schemas.microsoft.com/office/word/2018/wordml/cex" xmlns:w16cid="http://schemas.microsoft.com/office/word/2016/wordml/cid" xmlns:w16="http://schemas.microsoft.com/office/word/2018/wordml" xmlns:w16du="http://schemas.microsoft.com/office/word/2023/wordml/word16du" xmlns:w16sdtdh="http://schemas.microsoft.com/office/word/2020/wordml/sdtdatahash" xmlns:w16sdtfl="http://schemas.microsoft.com/office/word/2024/wordml/sdtformatlock" xmlns:w16se="http://schemas.microsoft.com/office/word/2015/wordml/symex" xmlns:wpg="http://schemas.microsoft.com/office/word/2010/wordprocessingGroup" xmlns:wpi="http://schemas.microsoft.com/office/word/2010/wordprocessingInk" xmlns:wne="http://schemas.microsoft.com/office/word/2006/wordml" xmlns:wps="http://schemas.microsoft.com/office/word/2010/wordprocessingShape" mc:Ignorable="w14 w15 w16se w16cid w16 w16cex w16sdtdh w16sdtfl w16du wp14">
   <w:abstractNum w:abstractNumId="0" w15:restartNumberingAfterBreak="0">
+    <w:nsid w:val="27C74A10"/>
+    <w:multiLevelType w:val="hybridMultilevel"/>
+    <w:tmpl w:val="28F81AFA"/>
+    <w:lvl w:ilvl="0" w:tplc="07EA0224">
+      <w:numFmt w:val="bullet"/>
+      <w:lvlText w:val="-"/>
+      <w:lvlJc w:val="left"/>
+      <w:pPr>
+        <w:ind w:left="1800" w:hanging="360"/>
+      </w:pPr>
+      <w:rPr>
+        <w:rFonts w:ascii="Times New Roman" w:eastAsia="Times New Roman" w:hAnsi="Times New Roman" w:cs="Times New Roman" w:hint="default"/>
+      </w:rPr>
+    </w:lvl>
+    <w:lvl w:ilvl="1" w:tplc="04090003" w:tentative="1">
+      <w:start w:val="1"/>
+      <w:numFmt w:val="bullet"/>
+      <w:lvlText w:val="o"/>
+      <w:lvlJc w:val="left"/>
+      <w:pPr>
+        <w:ind w:left="2520" w:hanging="360"/>
+      </w:pPr>
+      <w:rPr>
+        <w:rFonts w:ascii="Courier New" w:hAnsi="Courier New" w:cs="Courier New" w:hint="default"/>
+      </w:rPr>
+    </w:lvl>
+    <w:lvl w:ilvl="2" w:tplc="04090005" w:tentative="1">
+      <w:start w:val="1"/>
+      <w:numFmt w:val="bullet"/>
+      <w:lvlText w:val=""/>
+      <w:lvlJc w:val="left"/>
+      <w:pPr>
+        <w:ind w:left="3240" w:hanging="360"/>
+      </w:pPr>
+      <w:rPr>
+        <w:rFonts w:ascii="Wingdings" w:hAnsi="Wingdings" w:hint="default"/>
+      </w:rPr>
+    </w:lvl>
+    <w:lvl w:ilvl="3" w:tplc="04090001" w:tentative="1">
+      <w:start w:val="1"/>
+      <w:numFmt w:val="bullet"/>
+      <w:lvlText w:val=""/>
+      <w:lvlJc w:val="left"/>
+      <w:pPr>
+        <w:ind w:left="3960" w:hanging="360"/>
+      </w:pPr>
+      <w:rPr>
+        <w:rFonts w:ascii="Symbol" w:hAnsi="Symbol" w:hint="default"/>
+      </w:rPr>
+    </w:lvl>
+    <w:lvl w:ilvl="4" w:tplc="04090003" w:tentative="1">
+      <w:start w:val="1"/>
+      <w:numFmt w:val="bullet"/>
+      <w:lvlText w:val="o"/>
+      <w:lvlJc w:val="left"/>
+      <w:pPr>
+        <w:ind w:left="4680" w:hanging="360"/>
+      </w:pPr>
+      <w:rPr>
+        <w:rFonts w:ascii="Courier New" w:hAnsi="Courier New" w:cs="Courier New" w:hint="default"/>
+      </w:rPr>
+    </w:lvl>
+    <w:lvl w:ilvl="5" w:tplc="04090005" w:tentative="1">
+      <w:start w:val="1"/>
+      <w:numFmt w:val="bullet"/>
+      <w:lvlText w:val=""/>
+      <w:lvlJc w:val="left"/>
+      <w:pPr>
+        <w:ind w:left="5400" w:hanging="360"/>
+      </w:pPr>
+      <w:rPr>
+        <w:rFonts w:ascii="Wingdings" w:hAnsi="Wingdings" w:hint="default"/>
+      </w:rPr>
+    </w:lvl>
+    <w:lvl w:ilvl="6" w:tplc="04090001" w:tentative="1">
+      <w:start w:val="1"/>
+      <w:numFmt w:val="bullet"/>
+      <w:lvlText w:val=""/>
+      <w:lvlJc w:val="left"/>
+      <w:pPr>
+        <w:ind w:left="6120" w:hanging="360"/>
+      </w:pPr>
+      <w:rPr>
+        <w:rFonts w:ascii="Symbol" w:hAnsi="Symbol" w:hint="default"/>
+      </w:rPr>
+    </w:lvl>
+    <w:lvl w:ilvl="7" w:tplc="04090003" w:tentative="1">
+      <w:start w:val="1"/>
+      <w:numFmt w:val="bullet"/>
+      <w:lvlText w:val="o"/>
+      <w:lvlJc w:val="left"/>
+      <w:pPr>
+        <w:ind w:left="6840" w:hanging="360"/>
+      </w:pPr>
+      <w:rPr>
+        <w:rFonts w:ascii="Courier New" w:hAnsi="Courier New" w:cs="Courier New" w:hint="default"/>
+      </w:rPr>
+    </w:lvl>
+    <w:lvl w:ilvl="8" w:tplc="04090005" w:tentative="1">
+      <w:start w:val="1"/>
+      <w:numFmt w:val="bullet"/>
+      <w:lvlText w:val=""/>
+      <w:lvlJc w:val="left"/>
+      <w:pPr>
+        <w:ind w:left="7560" w:hanging="360"/>
+      </w:pPr>
+      <w:rPr>
+        <w:rFonts w:ascii="Wingdings" w:hAnsi="Wingdings" w:hint="default"/>
+      </w:rPr>
+    </w:lvl>
+  </w:abstractNum>
+  <w:abstractNum w:abstractNumId="1" w15:restartNumberingAfterBreak="0">
+    <w:nsid w:val="326C06A5"/>
+    <w:multiLevelType w:val="hybridMultilevel"/>
+    <w:tmpl w:val="1FF0BB28"/>
+    <w:lvl w:ilvl="0" w:tplc="07EA0224">
+      <w:numFmt w:val="bullet"/>
+      <w:lvlText w:val="-"/>
+      <w:lvlJc w:val="left"/>
+      <w:pPr>
+        <w:ind w:left="1800" w:hanging="360"/>
+      </w:pPr>
+      <w:rPr>
+        <w:rFonts w:ascii="Times New Roman" w:eastAsia="Times New Roman" w:hAnsi="Times New Roman" w:cs="Times New Roman" w:hint="default"/>
+      </w:rPr>
+    </w:lvl>
+    <w:lvl w:ilvl="1" w:tplc="04090003" w:tentative="1">
+      <w:start w:val="1"/>
+      <w:numFmt w:val="bullet"/>
+      <w:lvlText w:val="o"/>
+      <w:lvlJc w:val="left"/>
+      <w:pPr>
+        <w:ind w:left="2520" w:hanging="360"/>
+      </w:pPr>
+      <w:rPr>
+        <w:rFonts w:ascii="Courier New" w:hAnsi="Courier New" w:cs="Courier New" w:hint="default"/>
+      </w:rPr>
+    </w:lvl>
+    <w:lvl w:ilvl="2" w:tplc="04090005" w:tentative="1">
+      <w:start w:val="1"/>
+      <w:numFmt w:val="bullet"/>
+      <w:lvlText w:val=""/>
+      <w:lvlJc w:val="left"/>
+      <w:pPr>
+        <w:ind w:left="3240" w:hanging="360"/>
+      </w:pPr>
+      <w:rPr>
+        <w:rFonts w:ascii="Wingdings" w:hAnsi="Wingdings" w:hint="default"/>
+      </w:rPr>
+    </w:lvl>
+    <w:lvl w:ilvl="3" w:tplc="04090001" w:tentative="1">
+      <w:start w:val="1"/>
+      <w:numFmt w:val="bullet"/>
+      <w:lvlText w:val=""/>
+      <w:lvlJc w:val="left"/>
+      <w:pPr>
+        <w:ind w:left="3960" w:hanging="360"/>
+      </w:pPr>
+      <w:rPr>
+        <w:rFonts w:ascii="Symbol" w:hAnsi="Symbol" w:hint="default"/>
+      </w:rPr>
+    </w:lvl>
+    <w:lvl w:ilvl="4" w:tplc="04090003" w:tentative="1">
+      <w:start w:val="1"/>
+      <w:numFmt w:val="bullet"/>
+      <w:lvlText w:val="o"/>
+      <w:lvlJc w:val="left"/>
+      <w:pPr>
+        <w:ind w:left="4680" w:hanging="360"/>
+      </w:pPr>
+      <w:rPr>
+        <w:rFonts w:ascii="Courier New" w:hAnsi="Courier New" w:cs="Courier New" w:hint="default"/>
+      </w:rPr>
+    </w:lvl>
+    <w:lvl w:ilvl="5" w:tplc="04090005" w:tentative="1">
+      <w:start w:val="1"/>
+      <w:numFmt w:val="bullet"/>
+      <w:lvlText w:val=""/>
+      <w:lvlJc w:val="left"/>
+      <w:pPr>
+        <w:ind w:left="5400" w:hanging="360"/>
+      </w:pPr>
+      <w:rPr>
+        <w:rFonts w:ascii="Wingdings" w:hAnsi="Wingdings" w:hint="default"/>
+      </w:rPr>
+    </w:lvl>
+    <w:lvl w:ilvl="6" w:tplc="04090001" w:tentative="1">
+      <w:start w:val="1"/>
+      <w:numFmt w:val="bullet"/>
+      <w:lvlText w:val=""/>
+      <w:lvlJc w:val="left"/>
+      <w:pPr>
+        <w:ind w:left="6120" w:hanging="360"/>
+      </w:pPr>
+      <w:rPr>
+        <w:rFonts w:ascii="Symbol" w:hAnsi="Symbol" w:hint="default"/>
+      </w:rPr>
+    </w:lvl>
+    <w:lvl w:ilvl="7" w:tplc="04090003" w:tentative="1">
+      <w:start w:val="1"/>
+      <w:numFmt w:val="bullet"/>
+      <w:lvlText w:val="o"/>
+      <w:lvlJc w:val="left"/>
+      <w:pPr>
+        <w:ind w:left="6840" w:hanging="360"/>
+      </w:pPr>
+      <w:rPr>
+        <w:rFonts w:ascii="Courier New" w:hAnsi="Courier New" w:cs="Courier New" w:hint="default"/>
+      </w:rPr>
+    </w:lvl>
+    <w:lvl w:ilvl="8" w:tplc="04090005" w:tentative="1">
+      <w:start w:val="1"/>
+      <w:numFmt w:val="bullet"/>
+      <w:lvlText w:val=""/>
+      <w:lvlJc w:val="left"/>
+      <w:pPr>
+        <w:ind w:left="7560" w:hanging="360"/>
+      </w:pPr>
+      <w:rPr>
+        <w:rFonts w:ascii="Wingdings" w:hAnsi="Wingdings" w:hint="default"/>
+      </w:rPr>
+    </w:lvl>
+  </w:abstractNum>
+  <w:abstractNum w:abstractNumId="2" w15:restartNumberingAfterBreak="0">
+    <w:nsid w:val="727714A0"/>
+    <w:multiLevelType w:val="hybridMultilevel"/>
+    <w:tmpl w:val="C75CA49E"/>
+    <w:lvl w:ilvl="0" w:tplc="04090001">
+      <w:start w:val="1"/>
+      <w:numFmt w:val="bullet"/>
+      <w:lvlText w:val=""/>
+      <w:lvlJc w:val="left"/>
+      <w:pPr>
+        <w:ind w:left="720" w:hanging="360"/>
+      </w:pPr>
+      <w:rPr>
+        <w:rFonts w:ascii="Symbol" w:hAnsi="Symbol" w:hint="default"/>
+      </w:rPr>
+    </w:lvl>
+    <w:lvl w:ilvl="1" w:tplc="04090003">
+      <w:start w:val="1"/>
+      <w:numFmt w:val="bullet"/>
+      <w:lvlText w:val="o"/>
+      <w:lvlJc w:val="left"/>
+      <w:pPr>
+        <w:ind w:left="1440" w:hanging="360"/>
+      </w:pPr>
+      <w:rPr>
+        <w:rFonts w:ascii="Courier New" w:hAnsi="Courier New" w:cs="Courier New" w:hint="default"/>
+      </w:rPr>
+    </w:lvl>
+    <w:lvl w:ilvl="2" w:tplc="04090005">
+      <w:start w:val="1"/>
+      <w:numFmt w:val="bullet"/>
+      <w:lvlText w:val=""/>
+      <w:lvlJc w:val="left"/>
+      <w:pPr>
+        <w:ind w:left="2160" w:hanging="360"/>
+      </w:pPr>
+      <w:rPr>
+        <w:rFonts w:ascii="Wingdings" w:hAnsi="Wingdings" w:hint="default"/>
+      </w:rPr>
+    </w:lvl>
+    <w:lvl w:ilvl="3" w:tplc="04090001">
+      <w:start w:val="1"/>
+      <w:numFmt w:val="bullet"/>
+      <w:lvlText w:val=""/>
+      <w:lvlJc w:val="left"/>
+      <w:pPr>
+        <w:ind w:left="2880" w:hanging="360"/>
+      </w:pPr>
+      <w:rPr>
+        <w:rFonts w:ascii="Symbol" w:hAnsi="Symbol" w:hint="default"/>
+      </w:rPr>
+    </w:lvl>
+    <w:lvl w:ilvl="4" w:tplc="04090003">
+      <w:start w:val="1"/>
+      <w:numFmt w:val="bullet"/>
+      <w:lvlText w:val="o"/>
+      <w:lvlJc w:val="left"/>
+      <w:pPr>
+        <w:ind w:left="3600" w:hanging="360"/>
+      </w:pPr>
+      <w:rPr>
+        <w:rFonts w:ascii="Courier New" w:hAnsi="Courier New" w:cs="Courier New" w:hint="default"/>
+      </w:rPr>
+    </w:lvl>
+    <w:lvl w:ilvl="5" w:tplc="04090005" w:tentative="1">
+      <w:start w:val="1"/>
+      <w:numFmt w:val="bullet"/>
+      <w:lvlText w:val=""/>
+      <w:lvlJc w:val="left"/>
+      <w:pPr>
+        <w:ind w:left="4320" w:hanging="360"/>
+      </w:pPr>
+      <w:rPr>
+        <w:rFonts w:ascii="Wingdings" w:hAnsi="Wingdings" w:hint="default"/>
+      </w:rPr>
+    </w:lvl>
+    <w:lvl w:ilvl="6" w:tplc="04090001" w:tentative="1">
+      <w:start w:val="1"/>
+      <w:numFmt w:val="bullet"/>
+      <w:lvlText w:val=""/>
+      <w:lvlJc w:val="left"/>
+      <w:pPr>
+        <w:ind w:left="5040" w:hanging="360"/>
+      </w:pPr>
+      <w:rPr>
+        <w:rFonts w:ascii="Symbol" w:hAnsi="Symbol" w:hint="default"/>
+      </w:rPr>
+    </w:lvl>
+    <w:lvl w:ilvl="7" w:tplc="04090003" w:tentative="1">
+      <w:start w:val="1"/>
+      <w:numFmt w:val="bullet"/>
+      <w:lvlText w:val="o"/>
+      <w:lvlJc w:val="left"/>
+      <w:pPr>
+        <w:ind w:left="5760" w:hanging="360"/>
+      </w:pPr>
+      <w:rPr>
+        <w:rFonts w:ascii="Courier New" w:hAnsi="Courier New" w:cs="Courier New" w:hint="default"/>
+      </w:rPr>
+    </w:lvl>
+    <w:lvl w:ilvl="8" w:tplc="04090005" w:tentative="1">
+      <w:start w:val="1"/>
+      <w:numFmt w:val="bullet"/>
+      <w:lvlText w:val=""/>
+      <w:lvlJc w:val="left"/>
+      <w:pPr>
+        <w:ind w:left="6480" w:hanging="360"/>
+      </w:pPr>
+      <w:rPr>
+        <w:rFonts w:ascii="Wingdings" w:hAnsi="Wingdings" w:hint="default"/>
+      </w:rPr>
+    </w:lvl>
+  </w:abstractNum>
+  <w:abstractNum w:abstractNumId="3" w15:restartNumberingAfterBreak="0">
     <w:nsid w:val="72AD1953"/>
     <w:multiLevelType w:val="hybridMultilevel"/>
     <w:tmpl w:val="565A0F62"/>
@@ -3936,11 +5587,136 @@
       </w:pPr>
     </w:lvl>
   </w:abstractNum>
+  <w:abstractNum w:abstractNumId="4" w15:restartNumberingAfterBreak="0">
+    <w:nsid w:val="730C5465"/>
+    <w:multiLevelType w:val="hybridMultilevel"/>
+    <w:tmpl w:val="00565A9C"/>
+    <w:lvl w:ilvl="0" w:tplc="04090001">
+      <w:start w:val="1"/>
+      <w:numFmt w:val="bullet"/>
+      <w:lvlText w:val=""/>
+      <w:lvlJc w:val="left"/>
+      <w:pPr>
+        <w:ind w:left="720" w:hanging="360"/>
+      </w:pPr>
+      <w:rPr>
+        <w:rFonts w:ascii="Symbol" w:hAnsi="Symbol" w:hint="default"/>
+      </w:rPr>
+    </w:lvl>
+    <w:lvl w:ilvl="1" w:tplc="04090003" w:tentative="1">
+      <w:start w:val="1"/>
+      <w:numFmt w:val="bullet"/>
+      <w:lvlText w:val="o"/>
+      <w:lvlJc w:val="left"/>
+      <w:pPr>
+        <w:ind w:left="1440" w:hanging="360"/>
+      </w:pPr>
+      <w:rPr>
+        <w:rFonts w:ascii="Courier New" w:hAnsi="Courier New" w:cs="Courier New" w:hint="default"/>
+      </w:rPr>
+    </w:lvl>
+    <w:lvl w:ilvl="2" w:tplc="04090005" w:tentative="1">
+      <w:start w:val="1"/>
+      <w:numFmt w:val="bullet"/>
+      <w:lvlText w:val=""/>
+      <w:lvlJc w:val="left"/>
+      <w:pPr>
+        <w:ind w:left="2160" w:hanging="360"/>
+      </w:pPr>
+      <w:rPr>
+        <w:rFonts w:ascii="Wingdings" w:hAnsi="Wingdings" w:hint="default"/>
+      </w:rPr>
+    </w:lvl>
+    <w:lvl w:ilvl="3" w:tplc="04090001" w:tentative="1">
+      <w:start w:val="1"/>
+      <w:numFmt w:val="bullet"/>
+      <w:lvlText w:val=""/>
+      <w:lvlJc w:val="left"/>
+      <w:pPr>
+        <w:ind w:left="2880" w:hanging="360"/>
+      </w:pPr>
+      <w:rPr>
+        <w:rFonts w:ascii="Symbol" w:hAnsi="Symbol" w:hint="default"/>
+      </w:rPr>
+    </w:lvl>
+    <w:lvl w:ilvl="4" w:tplc="04090003" w:tentative="1">
+      <w:start w:val="1"/>
+      <w:numFmt w:val="bullet"/>
+      <w:lvlText w:val="o"/>
+      <w:lvlJc w:val="left"/>
+      <w:pPr>
+        <w:ind w:left="3600" w:hanging="360"/>
+      </w:pPr>
+      <w:rPr>
+        <w:rFonts w:ascii="Courier New" w:hAnsi="Courier New" w:cs="Courier New" w:hint="default"/>
+      </w:rPr>
+    </w:lvl>
+    <w:lvl w:ilvl="5" w:tplc="04090005" w:tentative="1">
+      <w:start w:val="1"/>
+      <w:numFmt w:val="bullet"/>
+      <w:lvlText w:val=""/>
+      <w:lvlJc w:val="left"/>
+      <w:pPr>
+        <w:ind w:left="4320" w:hanging="360"/>
+      </w:pPr>
+      <w:rPr>
+        <w:rFonts w:ascii="Wingdings" w:hAnsi="Wingdings" w:hint="default"/>
+      </w:rPr>
+    </w:lvl>
+    <w:lvl w:ilvl="6" w:tplc="04090001" w:tentative="1">
+      <w:start w:val="1"/>
+      <w:numFmt w:val="bullet"/>
+      <w:lvlText w:val=""/>
+      <w:lvlJc w:val="left"/>
+      <w:pPr>
+        <w:ind w:left="5040" w:hanging="360"/>
+      </w:pPr>
+      <w:rPr>
+        <w:rFonts w:ascii="Symbol" w:hAnsi="Symbol" w:hint="default"/>
+      </w:rPr>
+    </w:lvl>
+    <w:lvl w:ilvl="7" w:tplc="04090003" w:tentative="1">
+      <w:start w:val="1"/>
+      <w:numFmt w:val="bullet"/>
+      <w:lvlText w:val="o"/>
+      <w:lvlJc w:val="left"/>
+      <w:pPr>
+        <w:ind w:left="5760" w:hanging="360"/>
+      </w:pPr>
+      <w:rPr>
+        <w:rFonts w:ascii="Courier New" w:hAnsi="Courier New" w:cs="Courier New" w:hint="default"/>
+      </w:rPr>
+    </w:lvl>
+    <w:lvl w:ilvl="8" w:tplc="04090005" w:tentative="1">
+      <w:start w:val="1"/>
+      <w:numFmt w:val="bullet"/>
+      <w:lvlText w:val=""/>
+      <w:lvlJc w:val="left"/>
+      <w:pPr>
+        <w:ind w:left="6480" w:hanging="360"/>
+      </w:pPr>
+      <w:rPr>
+        <w:rFonts w:ascii="Wingdings" w:hAnsi="Wingdings" w:hint="default"/>
+      </w:rPr>
+    </w:lvl>
+  </w:abstractNum>
   <w:num w:numId="1" w16cid:durableId="420762612">
-    <w:abstractNumId w:val="0"/>
+    <w:abstractNumId w:val="3"/>
     <w:lvlOverride w:ilvl="0">
       <w:startOverride w:val="1"/>
     </w:lvlOverride>
+  </w:num>
+  <w:num w:numId="2" w16cid:durableId="800078877">
+    <w:abstractNumId w:val="2"/>
+  </w:num>
+  <w:num w:numId="3" w16cid:durableId="37359415">
+    <w:abstractNumId w:val="4"/>
+  </w:num>
+  <w:num w:numId="4" w16cid:durableId="1589535034">
+    <w:abstractNumId w:val="1"/>
+  </w:num>
+  <w:num w:numId="5" w16cid:durableId="1004551482">
+    <w:abstractNumId w:val="0"/>
   </w:num>
 </w:numbering>
 </file>
@@ -4339,6 +6115,12 @@
   <w:style w:type="paragraph" w:default="1" w:styleId="Normal">
     <w:name w:val="Normal"/>
     <w:qFormat/>
+    <w:rsid w:val="00FD687F"/>
+    <w:rPr>
+      <w:rFonts w:ascii="Times New Roman" w:eastAsia="Times New Roman" w:hAnsi="Times New Roman" w:cs="Times New Roman"/>
+      <w:sz w:val="24"/>
+      <w:szCs w:val="24"/>
+    </w:rPr>
   </w:style>
   <w:style w:type="paragraph" w:styleId="Heading1">
     <w:name w:val="heading 1"/>
@@ -4433,7 +6215,6 @@
   <w:style w:type="character" w:default="1" w:styleId="DefaultParagraphFont">
     <w:name w:val="Default Paragraph Font"/>
     <w:uiPriority w:val="1"/>
-    <w:semiHidden/>
     <w:unhideWhenUsed/>
   </w:style>
   <w:style w:type="table" w:default="1" w:styleId="TableNormal">

</xml_diff>

<commit_message>
toiling. broke out means for policy and deservingness. fixing chapter 1.
</commit_message>
<xml_diff>
--- a/atkeson_carrillo_citation_map.docx
+++ b/atkeson_carrillo_citation_map.docx
@@ -5137,6 +5137,109 @@
       <w:r>
         <w:t>Hedge, Button and Spear 1996 (b)</w:t>
       </w:r>
+    </w:p>
+    <w:p>
+      <w:pPr>
+        <w:spacing w:before="100"/>
+        <w:rPr>
+          <w:b/>
+          <w:bCs/>
+        </w:rPr>
+      </w:pPr>
+    </w:p>
+    <w:p>
+      <w:r>
+        <w:t>Giger N, Rosset J, Bernauer J. 2012. The poor representation of the poor in a comparative perspective. Representation 48:47–61</w:t>
+      </w:r>
+    </w:p>
+    <w:p>
+      <w:r>
+        <w:t>Highlight all</w:t>
+      </w:r>
+    </w:p>
+    <w:p>
+      <w:r>
+        <w:t>Match case</w:t>
+      </w:r>
+    </w:p>
+    <w:p>
+      <w:r>
+        <w:t>Whole words</w:t>
+      </w:r>
+    </w:p>
+    <w:p>
+      <w:r>
+        <w:t>Search result: 2. Total search results: 13. Page: 259. …focused on politicians' personal policy preferences, which are not constrained…</w:t>
+      </w:r>
+    </w:p>
+    <w:p>
+      <w:r>
+        <w:lastRenderedPageBreak/>
+        <w:t>Giger N, Rosset J, Bernauer J. 2012. The poor representation of the poor in a comparative perspective. Representation 48:47–61</w:t>
+      </w:r>
+    </w:p>
+    <w:p>
+      <w:r>
+        <w:t>Highlight all</w:t>
+      </w:r>
+    </w:p>
+    <w:p>
+      <w:r>
+        <w:t>Match case</w:t>
+      </w:r>
+    </w:p>
+    <w:p>
+      <w:r>
+        <w:t>Whole words</w:t>
+      </w:r>
+    </w:p>
+    <w:p>
+      <w:r>
+        <w:t>Search result: 2. Total search results: 13. Page: 259. …focused on politicians' personal policy preferences, which are not constrained…</w:t>
+      </w:r>
+    </w:p>
+    <w:p>
+      <w:pPr>
+        <w:spacing w:before="100"/>
+        <w:rPr>
+          <w:b/>
+          <w:bCs/>
+        </w:rPr>
+      </w:pPr>
+    </w:p>
+    <w:p>
+      <w:r>
+        <w:t>Persson M. 2021. From opinions to policies: examining the links between citizens, representatives, and policy change. Elect. Stud. 74:102413</w:t>
+      </w:r>
+    </w:p>
+    <w:p>
+      <w:r>
+        <w:t>Highlight all</w:t>
+      </w:r>
+    </w:p>
+    <w:p>
+      <w:r>
+        <w:t>Match case</w:t>
+      </w:r>
+    </w:p>
+    <w:p>
+      <w:r>
+        <w:t>Whole words</w:t>
+      </w:r>
+    </w:p>
+    <w:p>
+      <w:r>
+        <w:t>Search result: 2. Total search results: 13. Page: 259. …focused on politicians' personal policy preferences, which are not constrained…</w:t>
+      </w:r>
+    </w:p>
+    <w:p>
+      <w:pPr>
+        <w:spacing w:before="100"/>
+        <w:rPr>
+          <w:b/>
+          <w:bCs/>
+        </w:rPr>
+      </w:pPr>
     </w:p>
     <w:p>
       <w:pPr>

</xml_diff>